<commit_message>
node js working in web developement
</commit_message>
<xml_diff>
--- a/NODE.docx
+++ b/NODE.docx
@@ -31,6 +31,7 @@
       </w:pPr>
       <w:r>
         <w:rPr>
+          <w:noProof/>
           <w:lang w:val="en-US"/>
         </w:rPr>
         <w:drawing>
@@ -49,7 +50,7 @@
                     <pic:cNvPicPr/>
                   </pic:nvPicPr>
                   <pic:blipFill>
-                    <a:blip r:embed="rId4"/>
+                    <a:blip r:embed="rId5"/>
                     <a:stretch>
                       <a:fillRect/>
                     </a:stretch>
@@ -70,6 +71,2579 @@
         </w:drawing>
       </w:r>
     </w:p>
+    <w:p>
+      <w:pPr>
+        <w:rPr>
+          <w:b/>
+          <w:bCs/>
+        </w:rPr>
+      </w:pPr>
+      <w:r>
+        <w:rPr>
+          <w:b/>
+          <w:bCs/>
+        </w:rPr>
+        <w:t>What is Node.js? (Detailed Explanation)</w:t>
+      </w:r>
+    </w:p>
+    <w:p>
+      <w:r>
+        <w:t>Before Node.js existed, JavaScript was mainly used only inside the browser.</w:t>
+      </w:r>
+    </w:p>
+    <w:p>
+      <w:r>
+        <w:t>For example:</w:t>
+      </w:r>
+    </w:p>
+    <w:p>
+      <w:r>
+        <w:t>alert("Hello");</w:t>
+      </w:r>
+    </w:p>
+    <w:p>
+      <w:proofErr w:type="spellStart"/>
+      <w:proofErr w:type="gramStart"/>
+      <w:r>
+        <w:t>document.getElementById</w:t>
+      </w:r>
+      <w:proofErr w:type="spellEnd"/>
+      <w:proofErr w:type="gramEnd"/>
+      <w:r>
+        <w:t>("title").</w:t>
+      </w:r>
+      <w:proofErr w:type="spellStart"/>
+      <w:r>
+        <w:t>innerHTML</w:t>
+      </w:r>
+      <w:proofErr w:type="spellEnd"/>
+      <w:r>
+        <w:t xml:space="preserve"> = "Welcome";</w:t>
+      </w:r>
+    </w:p>
+    <w:p>
+      <w:r>
+        <w:t>These scripts run inside browsers such as:</w:t>
+      </w:r>
+    </w:p>
+    <w:p>
+      <w:pPr>
+        <w:numPr>
+          <w:ilvl w:val="0"/>
+          <w:numId w:val="1"/>
+        </w:numPr>
+      </w:pPr>
+      <w:r>
+        <w:t>Google Chrome</w:t>
+      </w:r>
+    </w:p>
+    <w:p>
+      <w:pPr>
+        <w:numPr>
+          <w:ilvl w:val="0"/>
+          <w:numId w:val="1"/>
+        </w:numPr>
+      </w:pPr>
+      <w:r>
+        <w:t>Mozilla Firefox</w:t>
+      </w:r>
+    </w:p>
+    <w:p>
+      <w:pPr>
+        <w:numPr>
+          <w:ilvl w:val="0"/>
+          <w:numId w:val="1"/>
+        </w:numPr>
+      </w:pPr>
+      <w:r>
+        <w:t>Microsoft Edge</w:t>
+      </w:r>
+    </w:p>
+    <w:p>
+      <w:r>
+        <w:t xml:space="preserve">JavaScript could manipulate web pages but could </w:t>
+      </w:r>
+      <w:r>
+        <w:rPr>
+          <w:b/>
+          <w:bCs/>
+        </w:rPr>
+        <w:t>not</w:t>
+      </w:r>
+      <w:r>
+        <w:t>:</w:t>
+      </w:r>
+    </w:p>
+    <w:p>
+      <w:r>
+        <w:rPr>
+          <w:rFonts w:ascii="Segoe UI Emoji" w:hAnsi="Segoe UI Emoji" w:cs="Segoe UI Emoji"/>
+        </w:rPr>
+        <w:t>❌</w:t>
+      </w:r>
+      <w:r>
+        <w:t xml:space="preserve"> Access databases directly</w:t>
+      </w:r>
+      <w:r>
+        <w:br/>
+      </w:r>
+      <w:r>
+        <w:rPr>
+          <w:rFonts w:ascii="Segoe UI Emoji" w:hAnsi="Segoe UI Emoji" w:cs="Segoe UI Emoji"/>
+        </w:rPr>
+        <w:t>❌</w:t>
+      </w:r>
+      <w:r>
+        <w:t xml:space="preserve"> Create web servers</w:t>
+      </w:r>
+      <w:r>
+        <w:br/>
+      </w:r>
+      <w:r>
+        <w:rPr>
+          <w:rFonts w:ascii="Segoe UI Emoji" w:hAnsi="Segoe UI Emoji" w:cs="Segoe UI Emoji"/>
+        </w:rPr>
+        <w:t>❌</w:t>
+      </w:r>
+      <w:r>
+        <w:t xml:space="preserve"> Read/write files on the computer</w:t>
+      </w:r>
+      <w:r>
+        <w:br/>
+      </w:r>
+      <w:r>
+        <w:rPr>
+          <w:rFonts w:ascii="Segoe UI Emoji" w:hAnsi="Segoe UI Emoji" w:cs="Segoe UI Emoji"/>
+        </w:rPr>
+        <w:t>❌</w:t>
+      </w:r>
+      <w:r>
+        <w:t xml:space="preserve"> Handle user authentication on the server</w:t>
+      </w:r>
+      <w:r>
+        <w:br/>
+      </w:r>
+      <w:r>
+        <w:rPr>
+          <w:rFonts w:ascii="Segoe UI Emoji" w:hAnsi="Segoe UI Emoji" w:cs="Segoe UI Emoji"/>
+        </w:rPr>
+        <w:t>❌</w:t>
+      </w:r>
+      <w:r>
+        <w:t xml:space="preserve"> Process backend business logic</w:t>
+      </w:r>
+    </w:p>
+    <w:p>
+      <w:r>
+        <w:t>Developers had to use other languages for backend development such as:</w:t>
+      </w:r>
+    </w:p>
+    <w:p>
+      <w:pPr>
+        <w:numPr>
+          <w:ilvl w:val="0"/>
+          <w:numId w:val="2"/>
+        </w:numPr>
+      </w:pPr>
+      <w:r>
+        <w:t>Java</w:t>
+      </w:r>
+    </w:p>
+    <w:p>
+      <w:pPr>
+        <w:numPr>
+          <w:ilvl w:val="0"/>
+          <w:numId w:val="2"/>
+        </w:numPr>
+      </w:pPr>
+      <w:r>
+        <w:lastRenderedPageBreak/>
+        <w:t>PHP</w:t>
+      </w:r>
+    </w:p>
+    <w:p>
+      <w:pPr>
+        <w:numPr>
+          <w:ilvl w:val="0"/>
+          <w:numId w:val="2"/>
+        </w:numPr>
+      </w:pPr>
+      <w:r>
+        <w:t>Python</w:t>
+      </w:r>
+    </w:p>
+    <w:p>
+      <w:pPr>
+        <w:numPr>
+          <w:ilvl w:val="0"/>
+          <w:numId w:val="2"/>
+        </w:numPr>
+      </w:pPr>
+      <w:r>
+        <w:t>C#</w:t>
+      </w:r>
+    </w:p>
+    <w:p>
+      <w:r>
+        <w:pict w14:anchorId="0C09635A">
+          <v:rect id="_x0000_i1205" style="width:0;height:1.5pt" o:hralign="center" o:hrstd="t" o:hr="t" fillcolor="#a0a0a0" stroked="f"/>
+        </w:pict>
+      </w:r>
+    </w:p>
+    <w:p>
+      <w:pPr>
+        <w:rPr>
+          <w:b/>
+          <w:bCs/>
+        </w:rPr>
+      </w:pPr>
+      <w:r>
+        <w:rPr>
+          <w:b/>
+          <w:bCs/>
+        </w:rPr>
+        <w:t>The Problem Before Node.js</w:t>
+      </w:r>
+    </w:p>
+    <w:p>
+      <w:r>
+        <w:t>Imagine you are building a college placement portal.</w:t>
+      </w:r>
+    </w:p>
+    <w:p>
+      <w:pPr>
+        <w:rPr>
+          <w:b/>
+          <w:bCs/>
+        </w:rPr>
+      </w:pPr>
+      <w:r>
+        <w:rPr>
+          <w:b/>
+          <w:bCs/>
+        </w:rPr>
+        <w:t>Frontend</w:t>
+      </w:r>
+    </w:p>
+    <w:p>
+      <w:r>
+        <w:t>Used:</w:t>
+      </w:r>
+    </w:p>
+    <w:p>
+      <w:r>
+        <w:t>HTML</w:t>
+      </w:r>
+    </w:p>
+    <w:p>
+      <w:r>
+        <w:t>CSS</w:t>
+      </w:r>
+    </w:p>
+    <w:p>
+      <w:r>
+        <w:t>JavaScript</w:t>
+      </w:r>
+    </w:p>
+    <w:p>
+      <w:pPr>
+        <w:rPr>
+          <w:b/>
+          <w:bCs/>
+        </w:rPr>
+      </w:pPr>
+      <w:r>
+        <w:rPr>
+          <w:b/>
+          <w:bCs/>
+        </w:rPr>
+        <w:t>Backend</w:t>
+      </w:r>
+    </w:p>
+    <w:p>
+      <w:r>
+        <w:t>Used:</w:t>
+      </w:r>
+    </w:p>
+    <w:p>
+      <w:r>
+        <w:t>Java</w:t>
+      </w:r>
+    </w:p>
+    <w:p>
+      <w:r>
+        <w:t>PHP</w:t>
+      </w:r>
+    </w:p>
+    <w:p>
+      <w:r>
+        <w:t>Python</w:t>
+      </w:r>
+    </w:p>
+    <w:p>
+      <w:proofErr w:type="gramStart"/>
+      <w:r>
+        <w:t>So</w:t>
+      </w:r>
+      <w:proofErr w:type="gramEnd"/>
+      <w:r>
+        <w:t xml:space="preserve"> developers had to know:</w:t>
+      </w:r>
+    </w:p>
+    <w:p>
+      <w:r>
+        <w:t>Frontend Language = JavaScript</w:t>
+      </w:r>
+    </w:p>
+    <w:p/>
+    <w:p>
+      <w:r>
+        <w:t>Backend Language = Java/PHP/Python</w:t>
+      </w:r>
+    </w:p>
+    <w:p>
+      <w:r>
+        <w:t>This created problems:</w:t>
+      </w:r>
+    </w:p>
+    <w:p>
+      <w:pPr>
+        <w:rPr>
+          <w:b/>
+          <w:bCs/>
+        </w:rPr>
+      </w:pPr>
+      <w:r>
+        <w:rPr>
+          <w:b/>
+          <w:bCs/>
+        </w:rPr>
+        <w:t>Problem 1: Two Different Languages</w:t>
+      </w:r>
+    </w:p>
+    <w:p>
+      <w:r>
+        <w:t>Frontend Developer:</w:t>
+      </w:r>
+    </w:p>
+    <w:p>
+      <w:r>
+        <w:t>let name = "Prajakta";</w:t>
+      </w:r>
+    </w:p>
+    <w:p>
+      <w:r>
+        <w:t>Backend Developer:</w:t>
+      </w:r>
+    </w:p>
+    <w:p>
+      <w:r>
+        <w:t>String name = "Prajakta";</w:t>
+      </w:r>
+    </w:p>
+    <w:p>
+      <w:r>
+        <w:t>Different syntax, different tools, different expertise.</w:t>
+      </w:r>
+    </w:p>
+    <w:p>
+      <w:r>
+        <w:pict w14:anchorId="5F35370E">
+          <v:rect id="_x0000_i1206" style="width:0;height:1.5pt" o:hralign="center" o:hrstd="t" o:hr="t" fillcolor="#a0a0a0" stroked="f"/>
+        </w:pict>
+      </w:r>
+    </w:p>
+    <w:p>
+      <w:pPr>
+        <w:rPr>
+          <w:b/>
+          <w:bCs/>
+        </w:rPr>
+      </w:pPr>
+      <w:r>
+        <w:rPr>
+          <w:b/>
+          <w:bCs/>
+        </w:rPr>
+        <w:lastRenderedPageBreak/>
+        <w:t>Problem 2: Context Switching</w:t>
+      </w:r>
+    </w:p>
+    <w:p>
+      <w:r>
+        <w:t>A developer constantly moved between:</w:t>
+      </w:r>
+    </w:p>
+    <w:p>
+      <w:r>
+        <w:t>JavaScript</w:t>
+      </w:r>
+    </w:p>
+    <w:p>
+      <w:r>
+        <w:t>↓</w:t>
+      </w:r>
+    </w:p>
+    <w:p>
+      <w:r>
+        <w:t>Java</w:t>
+      </w:r>
+    </w:p>
+    <w:p>
+      <w:r>
+        <w:t>↓</w:t>
+      </w:r>
+    </w:p>
+    <w:p>
+      <w:r>
+        <w:t>SQL</w:t>
+      </w:r>
+    </w:p>
+    <w:p>
+      <w:r>
+        <w:t>↓</w:t>
+      </w:r>
+    </w:p>
+    <w:p>
+      <w:r>
+        <w:t>JavaScript</w:t>
+      </w:r>
+    </w:p>
+    <w:p>
+      <w:r>
+        <w:t>This slowed development.</w:t>
+      </w:r>
+    </w:p>
+    <w:p>
+      <w:r>
+        <w:pict w14:anchorId="178DF93E">
+          <v:rect id="_x0000_i1207" style="width:0;height:1.5pt" o:hralign="center" o:hrstd="t" o:hr="t" fillcolor="#a0a0a0" stroked="f"/>
+        </w:pict>
+      </w:r>
+    </w:p>
+    <w:p>
+      <w:pPr>
+        <w:rPr>
+          <w:b/>
+          <w:bCs/>
+        </w:rPr>
+      </w:pPr>
+      <w:r>
+        <w:rPr>
+          <w:b/>
+          <w:bCs/>
+        </w:rPr>
+        <w:t>Problem 3: Real-Time Applications</w:t>
+      </w:r>
+    </w:p>
+    <w:p>
+      <w:r>
+        <w:t>Applications like:</w:t>
+      </w:r>
+    </w:p>
+    <w:p>
+      <w:pPr>
+        <w:numPr>
+          <w:ilvl w:val="0"/>
+          <w:numId w:val="3"/>
+        </w:numPr>
+      </w:pPr>
+      <w:r>
+        <w:t>Chat systems</w:t>
+      </w:r>
+    </w:p>
+    <w:p>
+      <w:pPr>
+        <w:numPr>
+          <w:ilvl w:val="0"/>
+          <w:numId w:val="3"/>
+        </w:numPr>
+      </w:pPr>
+      <w:r>
+        <w:t>Notifications</w:t>
+      </w:r>
+    </w:p>
+    <w:p>
+      <w:pPr>
+        <w:numPr>
+          <w:ilvl w:val="0"/>
+          <w:numId w:val="3"/>
+        </w:numPr>
+      </w:pPr>
+      <w:r>
+        <w:t>Live tracking</w:t>
+      </w:r>
+    </w:p>
+    <w:p>
+      <w:pPr>
+        <w:numPr>
+          <w:ilvl w:val="0"/>
+          <w:numId w:val="3"/>
+        </w:numPr>
+      </w:pPr>
+      <w:r>
+        <w:t>Online gaming</w:t>
+      </w:r>
+    </w:p>
+    <w:p>
+      <w:r>
+        <w:t>needed thousands of simultaneous connections.</w:t>
+      </w:r>
+    </w:p>
+    <w:p>
+      <w:r>
+        <w:t>Traditional servers struggled with this efficiently.</w:t>
+      </w:r>
+    </w:p>
+    <w:p>
+      <w:r>
+        <w:pict w14:anchorId="3C9F7B3E">
+          <v:rect id="_x0000_i1208" style="width:0;height:1.5pt" o:hralign="center" o:hrstd="t" o:hr="t" fillcolor="#a0a0a0" stroked="f"/>
+        </w:pict>
+      </w:r>
+    </w:p>
+    <w:p>
+      <w:pPr>
+        <w:rPr>
+          <w:b/>
+          <w:bCs/>
+        </w:rPr>
+      </w:pPr>
+      <w:r>
+        <w:rPr>
+          <w:b/>
+          <w:bCs/>
+        </w:rPr>
+        <w:t>How Node.js Was Created</w:t>
+      </w:r>
+    </w:p>
+    <w:p>
+      <w:r>
+        <w:t>In 2009, Ryan Dahl asked:</w:t>
+      </w:r>
+    </w:p>
+    <w:p>
+      <w:r>
+        <w:t>"Why can't JavaScript run outside the browser?"</w:t>
+      </w:r>
+    </w:p>
+    <w:p>
+      <w:r>
+        <w:t>He used Google's V8 Engine (the engine inside Chrome) and built Node.js.</w:t>
+      </w:r>
+    </w:p>
+    <w:p>
+      <w:r>
+        <w:t>Result:</w:t>
+      </w:r>
+    </w:p>
+    <w:p>
+      <w:r>
+        <w:t>JavaScript</w:t>
+      </w:r>
+    </w:p>
+    <w:p>
+      <w:r>
+        <w:t>can now run</w:t>
+      </w:r>
+    </w:p>
+    <w:p>
+      <w:r>
+        <w:t>outside the browser</w:t>
+      </w:r>
+    </w:p>
+    <w:p>
+      <w:r>
+        <w:lastRenderedPageBreak/>
+        <w:t>This was a major shift in web development.</w:t>
+      </w:r>
+    </w:p>
+    <w:p>
+      <w:r>
+        <w:pict w14:anchorId="4D47CA72">
+          <v:rect id="_x0000_i1209" style="width:0;height:1.5pt" o:hralign="center" o:hrstd="t" o:hr="t" fillcolor="#a0a0a0" stroked="f"/>
+        </w:pict>
+      </w:r>
+    </w:p>
+    <w:p>
+      <w:pPr>
+        <w:rPr>
+          <w:b/>
+          <w:bCs/>
+        </w:rPr>
+      </w:pPr>
+      <w:r>
+        <w:rPr>
+          <w:b/>
+          <w:bCs/>
+        </w:rPr>
+        <w:t>What Exactly Is Node.js?</w:t>
+      </w:r>
+    </w:p>
+    <w:p>
+      <w:r>
+        <w:t>Node.js is:</w:t>
+      </w:r>
+    </w:p>
+    <w:p>
+      <w:r>
+        <w:t>A runtime environment that allows JavaScript to run on the server.</w:t>
+      </w:r>
+    </w:p>
+    <w:p>
+      <w:r>
+        <w:t>Think of it like this:</w:t>
+      </w:r>
+    </w:p>
+    <w:p>
+      <w:pPr>
+        <w:rPr>
+          <w:b/>
+          <w:bCs/>
+        </w:rPr>
+      </w:pPr>
+      <w:r>
+        <w:rPr>
+          <w:b/>
+          <w:bCs/>
+        </w:rPr>
+        <w:t>Without Node.js</w:t>
+      </w:r>
+    </w:p>
+    <w:p>
+      <w:r>
+        <w:t>JavaScript</w:t>
+      </w:r>
+    </w:p>
+    <w:p>
+      <w:r>
+        <w:t xml:space="preserve">      ↓</w:t>
+      </w:r>
+    </w:p>
+    <w:p>
+      <w:r>
+        <w:t>Browser Only</w:t>
+      </w:r>
+    </w:p>
+    <w:p>
+      <w:pPr>
+        <w:rPr>
+          <w:b/>
+          <w:bCs/>
+        </w:rPr>
+      </w:pPr>
+      <w:r>
+        <w:rPr>
+          <w:b/>
+          <w:bCs/>
+        </w:rPr>
+        <w:t>With Node.js</w:t>
+      </w:r>
+    </w:p>
+    <w:p>
+      <w:r>
+        <w:t>JavaScript</w:t>
+      </w:r>
+    </w:p>
+    <w:p>
+      <w:r>
+        <w:t xml:space="preserve">      ↓</w:t>
+      </w:r>
+    </w:p>
+    <w:p>
+      <w:r>
+        <w:t>Browser</w:t>
+      </w:r>
+    </w:p>
+    <w:p>
+      <w:r>
+        <w:t xml:space="preserve">      +</w:t>
+      </w:r>
+    </w:p>
+    <w:p>
+      <w:r>
+        <w:t>Server</w:t>
+      </w:r>
+    </w:p>
+    <w:p>
+      <w:r>
+        <w:t>Now JavaScript can:</w:t>
+      </w:r>
+    </w:p>
+    <w:p>
+      <w:r>
+        <w:rPr>
+          <w:rFonts w:ascii="Segoe UI Emoji" w:hAnsi="Segoe UI Emoji" w:cs="Segoe UI Emoji"/>
+        </w:rPr>
+        <w:t>✅</w:t>
+      </w:r>
+      <w:r>
+        <w:t xml:space="preserve"> Create servers</w:t>
+      </w:r>
+      <w:r>
+        <w:br/>
+      </w:r>
+      <w:r>
+        <w:rPr>
+          <w:rFonts w:ascii="Segoe UI Emoji" w:hAnsi="Segoe UI Emoji" w:cs="Segoe UI Emoji"/>
+        </w:rPr>
+        <w:t>✅</w:t>
+      </w:r>
+      <w:r>
+        <w:t xml:space="preserve"> Connect to databases</w:t>
+      </w:r>
+      <w:r>
+        <w:br/>
+      </w:r>
+      <w:r>
+        <w:rPr>
+          <w:rFonts w:ascii="Segoe UI Emoji" w:hAnsi="Segoe UI Emoji" w:cs="Segoe UI Emoji"/>
+        </w:rPr>
+        <w:t>✅</w:t>
+      </w:r>
+      <w:r>
+        <w:t xml:space="preserve"> Handle authentication</w:t>
+      </w:r>
+      <w:r>
+        <w:br/>
+      </w:r>
+      <w:r>
+        <w:rPr>
+          <w:rFonts w:ascii="Segoe UI Emoji" w:hAnsi="Segoe UI Emoji" w:cs="Segoe UI Emoji"/>
+        </w:rPr>
+        <w:t>✅</w:t>
+      </w:r>
+      <w:r>
+        <w:t xml:space="preserve"> Read files</w:t>
+      </w:r>
+      <w:r>
+        <w:br/>
+      </w:r>
+      <w:r>
+        <w:rPr>
+          <w:rFonts w:ascii="Segoe UI Emoji" w:hAnsi="Segoe UI Emoji" w:cs="Segoe UI Emoji"/>
+        </w:rPr>
+        <w:t>✅</w:t>
+      </w:r>
+      <w:r>
+        <w:t xml:space="preserve"> Send emails</w:t>
+      </w:r>
+      <w:r>
+        <w:br/>
+      </w:r>
+      <w:r>
+        <w:rPr>
+          <w:rFonts w:ascii="Segoe UI Emoji" w:hAnsi="Segoe UI Emoji" w:cs="Segoe UI Emoji"/>
+        </w:rPr>
+        <w:t>✅</w:t>
+      </w:r>
+      <w:r>
+        <w:t xml:space="preserve"> Build APIs</w:t>
+      </w:r>
+    </w:p>
+    <w:p>
+      <w:r>
+        <w:pict w14:anchorId="562E57D9">
+          <v:rect id="_x0000_i1210" style="width:0;height:1.5pt" o:hralign="center" o:hrstd="t" o:hr="t" fillcolor="#a0a0a0" stroked="f"/>
+        </w:pict>
+      </w:r>
+    </w:p>
+    <w:p>
+      <w:pPr>
+        <w:rPr>
+          <w:b/>
+          <w:bCs/>
+        </w:rPr>
+      </w:pPr>
+      <w:r>
+        <w:rPr>
+          <w:b/>
+          <w:bCs/>
+        </w:rPr>
+        <w:t>What Changed in Web Development?</w:t>
+      </w:r>
+    </w:p>
+    <w:p>
+      <w:r>
+        <w:t>Before Node.js:</w:t>
+      </w:r>
+    </w:p>
+    <w:p>
+      <w:r>
+        <w:t>Frontend → JavaScript</w:t>
+      </w:r>
+    </w:p>
+    <w:p/>
+    <w:p>
+      <w:r>
+        <w:t>Backend → Java/PHP/Python</w:t>
+      </w:r>
+    </w:p>
+    <w:p>
+      <w:r>
+        <w:lastRenderedPageBreak/>
+        <w:t>After Node.js:</w:t>
+      </w:r>
+    </w:p>
+    <w:p>
+      <w:r>
+        <w:t>Frontend → JavaScript</w:t>
+      </w:r>
+    </w:p>
+    <w:p/>
+    <w:p>
+      <w:r>
+        <w:t>Backend → JavaScript</w:t>
+      </w:r>
+    </w:p>
+    <w:p>
+      <w:r>
+        <w:t>A single developer could build an entire application.</w:t>
+      </w:r>
+    </w:p>
+    <w:p>
+      <w:r>
+        <w:t>This gave rise to full-stack JavaScript development.</w:t>
+      </w:r>
+    </w:p>
+    <w:p>
+      <w:r>
+        <w:pict w14:anchorId="4AECF0E7">
+          <v:rect id="_x0000_i1211" style="width:0;height:1.5pt" o:hralign="center" o:hrstd="t" o:hr="t" fillcolor="#a0a0a0" stroked="f"/>
+        </w:pict>
+      </w:r>
+    </w:p>
+    <w:p>
+      <w:pPr>
+        <w:rPr>
+          <w:b/>
+          <w:bCs/>
+        </w:rPr>
+      </w:pPr>
+      <w:r>
+        <w:rPr>
+          <w:b/>
+          <w:bCs/>
+        </w:rPr>
+        <w:t>Traditional Web Development</w:t>
+      </w:r>
+    </w:p>
+    <w:p>
+      <w:r>
+        <w:t>User</w:t>
+      </w:r>
+    </w:p>
+    <w:p>
+      <w:r>
+        <w:t xml:space="preserve">  ↓</w:t>
+      </w:r>
+    </w:p>
+    <w:p>
+      <w:r>
+        <w:t>Browser</w:t>
+      </w:r>
+    </w:p>
+    <w:p>
+      <w:r>
+        <w:t xml:space="preserve">  ↓</w:t>
+      </w:r>
+    </w:p>
+    <w:p>
+      <w:r>
+        <w:t>Apache/Tomcat</w:t>
+      </w:r>
+    </w:p>
+    <w:p>
+      <w:r>
+        <w:t xml:space="preserve">  ↓</w:t>
+      </w:r>
+    </w:p>
+    <w:p>
+      <w:r>
+        <w:t>Java/PHP Backend</w:t>
+      </w:r>
+    </w:p>
+    <w:p>
+      <w:r>
+        <w:t xml:space="preserve">  ↓</w:t>
+      </w:r>
+    </w:p>
+    <w:p>
+      <w:r>
+        <w:t>Database</w:t>
+      </w:r>
+    </w:p>
+    <w:p>
+      <w:r>
+        <w:t>Many layers.</w:t>
+      </w:r>
+    </w:p>
+    <w:p>
+      <w:r>
+        <w:pict w14:anchorId="7EE2BC49">
+          <v:rect id="_x0000_i1212" style="width:0;height:1.5pt" o:hralign="center" o:hrstd="t" o:hr="t" fillcolor="#a0a0a0" stroked="f"/>
+        </w:pict>
+      </w:r>
+    </w:p>
+    <w:p>
+      <w:pPr>
+        <w:rPr>
+          <w:b/>
+          <w:bCs/>
+        </w:rPr>
+      </w:pPr>
+      <w:r>
+        <w:rPr>
+          <w:b/>
+          <w:bCs/>
+        </w:rPr>
+        <w:t>Node.js-Based Development</w:t>
+      </w:r>
+    </w:p>
+    <w:p>
+      <w:r>
+        <w:t>User</w:t>
+      </w:r>
+    </w:p>
+    <w:p>
+      <w:r>
+        <w:t xml:space="preserve">  ↓</w:t>
+      </w:r>
+    </w:p>
+    <w:p>
+      <w:r>
+        <w:t>Browser</w:t>
+      </w:r>
+    </w:p>
+    <w:p>
+      <w:r>
+        <w:t xml:space="preserve">  ↓</w:t>
+      </w:r>
+    </w:p>
+    <w:p>
+      <w:r>
+        <w:t>Node.js Server</w:t>
+      </w:r>
+    </w:p>
+    <w:p>
+      <w:r>
+        <w:t xml:space="preserve">  ↓</w:t>
+      </w:r>
+    </w:p>
+    <w:p>
+      <w:r>
+        <w:t>Database</w:t>
+      </w:r>
+    </w:p>
+    <w:p>
+      <w:r>
+        <w:t>Simpler architecture.</w:t>
+      </w:r>
+    </w:p>
+    <w:p>
+      <w:r>
+        <w:lastRenderedPageBreak/>
+        <w:pict w14:anchorId="5B5E2BB6">
+          <v:rect id="_x0000_i1213" style="width:0;height:1.5pt" o:hralign="center" o:hrstd="t" o:hr="t" fillcolor="#a0a0a0" stroked="f"/>
+        </w:pict>
+      </w:r>
+    </w:p>
+    <w:p>
+      <w:pPr>
+        <w:rPr>
+          <w:b/>
+          <w:bCs/>
+        </w:rPr>
+      </w:pPr>
+      <w:r>
+        <w:rPr>
+          <w:b/>
+          <w:bCs/>
+        </w:rPr>
+        <w:t>How Node.js Works Internally</w:t>
+      </w:r>
+    </w:p>
+    <w:p>
+      <w:r>
+        <w:t>This is the most important concept.</w:t>
+      </w:r>
+    </w:p>
+    <w:p>
+      <w:r>
+        <w:t>Node.js uses:</w:t>
+      </w:r>
+    </w:p>
+    <w:p>
+      <w:r>
+        <w:t>Single Thread</w:t>
+      </w:r>
+    </w:p>
+    <w:p>
+      <w:r>
+        <w:t>+</w:t>
+      </w:r>
+    </w:p>
+    <w:p>
+      <w:r>
+        <w:t>Event Loop</w:t>
+      </w:r>
+    </w:p>
+    <w:p>
+      <w:r>
+        <w:t>+</w:t>
+      </w:r>
+    </w:p>
+    <w:p>
+      <w:r>
+        <w:t>Non-Blocking I/O</w:t>
+      </w:r>
+    </w:p>
+    <w:p>
+      <w:r>
+        <w:pict w14:anchorId="46BFD43C">
+          <v:rect id="_x0000_i1214" style="width:0;height:1.5pt" o:hralign="center" o:hrstd="t" o:hr="t" fillcolor="#a0a0a0" stroked="f"/>
+        </w:pict>
+      </w:r>
+    </w:p>
+    <w:p>
+      <w:pPr>
+        <w:rPr>
+          <w:b/>
+          <w:bCs/>
+        </w:rPr>
+      </w:pPr>
+      <w:r>
+        <w:rPr>
+          <w:b/>
+          <w:bCs/>
+        </w:rPr>
+        <w:t>Traditional Server Model</w:t>
+      </w:r>
+    </w:p>
+    <w:p>
+      <w:r>
+        <w:t>Imagine 3 users visit a website.</w:t>
+      </w:r>
+    </w:p>
+    <w:p>
+      <w:pPr>
+        <w:rPr>
+          <w:b/>
+          <w:bCs/>
+        </w:rPr>
+      </w:pPr>
+      <w:r>
+        <w:rPr>
+          <w:b/>
+          <w:bCs/>
+        </w:rPr>
+        <w:t>User 1</w:t>
+      </w:r>
+    </w:p>
+    <w:p>
+      <w:r>
+        <w:t>Needs 5 seconds.</w:t>
+      </w:r>
+    </w:p>
+    <w:p>
+      <w:pPr>
+        <w:rPr>
+          <w:b/>
+          <w:bCs/>
+        </w:rPr>
+      </w:pPr>
+      <w:r>
+        <w:rPr>
+          <w:b/>
+          <w:bCs/>
+        </w:rPr>
+        <w:t>User 2</w:t>
+      </w:r>
+    </w:p>
+    <w:p>
+      <w:r>
+        <w:t>Needs 2 seconds.</w:t>
+      </w:r>
+    </w:p>
+    <w:p>
+      <w:pPr>
+        <w:rPr>
+          <w:b/>
+          <w:bCs/>
+        </w:rPr>
+      </w:pPr>
+      <w:r>
+        <w:rPr>
+          <w:b/>
+          <w:bCs/>
+        </w:rPr>
+        <w:t>User 3</w:t>
+      </w:r>
+    </w:p>
+    <w:p>
+      <w:r>
+        <w:t>Needs 1 second.</w:t>
+      </w:r>
+    </w:p>
+    <w:p>
+      <w:r>
+        <w:t>Traditional processing:</w:t>
+      </w:r>
+    </w:p>
+    <w:p>
+      <w:r>
+        <w:t>User 1</w:t>
+      </w:r>
+    </w:p>
+    <w:p>
+      <w:r>
+        <w:t xml:space="preserve">  ↓</w:t>
+      </w:r>
+    </w:p>
+    <w:p>
+      <w:r>
+        <w:t>Processing (5 sec)</w:t>
+      </w:r>
+    </w:p>
+    <w:p/>
+    <w:p>
+      <w:r>
+        <w:t>User 2 waits</w:t>
+      </w:r>
+    </w:p>
+    <w:p/>
+    <w:p>
+      <w:r>
+        <w:t>User 3 waits</w:t>
+      </w:r>
+    </w:p>
+    <w:p>
+      <w:r>
+        <w:t>Total:</w:t>
+      </w:r>
+    </w:p>
+    <w:p>
+      <w:r>
+        <w:t>5 + 2 + 1</w:t>
+      </w:r>
+    </w:p>
+    <w:p>
+      <w:r>
+        <w:lastRenderedPageBreak/>
+        <w:t>=</w:t>
+      </w:r>
+    </w:p>
+    <w:p>
+      <w:r>
+        <w:t>8 seconds</w:t>
+      </w:r>
+    </w:p>
+    <w:p>
+      <w:r>
+        <w:t>Many requests wait in line.</w:t>
+      </w:r>
+    </w:p>
+    <w:p>
+      <w:r>
+        <w:pict w14:anchorId="483DE9F2">
+          <v:rect id="_x0000_i1215" style="width:0;height:1.5pt" o:hralign="center" o:hrstd="t" o:hr="t" fillcolor="#a0a0a0" stroked="f"/>
+        </w:pict>
+      </w:r>
+    </w:p>
+    <w:p>
+      <w:pPr>
+        <w:rPr>
+          <w:b/>
+          <w:bCs/>
+        </w:rPr>
+      </w:pPr>
+      <w:r>
+        <w:rPr>
+          <w:b/>
+          <w:bCs/>
+        </w:rPr>
+        <w:t>Node.js Model</w:t>
+      </w:r>
+    </w:p>
+    <w:p>
+      <w:r>
+        <w:t>Node.js does not wait.</w:t>
+      </w:r>
+    </w:p>
+    <w:p>
+      <w:r>
+        <w:t>Request 1</w:t>
+      </w:r>
+    </w:p>
+    <w:p>
+      <w:r>
+        <w:t>↓</w:t>
+      </w:r>
+    </w:p>
+    <w:p>
+      <w:r>
+        <w:t>Send to background</w:t>
+      </w:r>
+    </w:p>
+    <w:p/>
+    <w:p>
+      <w:r>
+        <w:t>Request 2</w:t>
+      </w:r>
+    </w:p>
+    <w:p>
+      <w:r>
+        <w:t>↓</w:t>
+      </w:r>
+    </w:p>
+    <w:p>
+      <w:r>
+        <w:t>Send to background</w:t>
+      </w:r>
+    </w:p>
+    <w:p/>
+    <w:p>
+      <w:r>
+        <w:t>Request 3</w:t>
+      </w:r>
+    </w:p>
+    <w:p>
+      <w:r>
+        <w:t>↓</w:t>
+      </w:r>
+    </w:p>
+    <w:p>
+      <w:r>
+        <w:t>Send to background</w:t>
+      </w:r>
+    </w:p>
+    <w:p>
+      <w:r>
+        <w:t>All continue simultaneously.</w:t>
+      </w:r>
+    </w:p>
+    <w:p>
+      <w:r>
+        <w:t>Request 1 → Running</w:t>
+      </w:r>
+    </w:p>
+    <w:p>
+      <w:r>
+        <w:t>Request 2 → Running</w:t>
+      </w:r>
+    </w:p>
+    <w:p>
+      <w:r>
+        <w:t>Request 3 → Running</w:t>
+      </w:r>
+    </w:p>
+    <w:p>
+      <w:r>
+        <w:t>This is called:</w:t>
+      </w:r>
+    </w:p>
+    <w:p>
+      <w:pPr>
+        <w:rPr>
+          <w:b/>
+          <w:bCs/>
+        </w:rPr>
+      </w:pPr>
+      <w:r>
+        <w:rPr>
+          <w:b/>
+          <w:bCs/>
+        </w:rPr>
+        <w:t>Non-Blocking I/O</w:t>
+      </w:r>
+    </w:p>
+    <w:p>
+      <w:r>
+        <w:t>Node.js starts a task and immediately moves to the next task.</w:t>
+      </w:r>
+    </w:p>
+    <w:p>
+      <w:r>
+        <w:pict w14:anchorId="0A44D530">
+          <v:rect id="_x0000_i1216" style="width:0;height:1.5pt" o:hralign="center" o:hrstd="t" o:hr="t" fillcolor="#a0a0a0" stroked="f"/>
+        </w:pict>
+      </w:r>
+    </w:p>
+    <w:p>
+      <w:pPr>
+        <w:rPr>
+          <w:b/>
+          <w:bCs/>
+        </w:rPr>
+      </w:pPr>
+      <w:r>
+        <w:rPr>
+          <w:b/>
+          <w:bCs/>
+        </w:rPr>
+        <w:t>Understanding the Event Loop</w:t>
+      </w:r>
+    </w:p>
+    <w:p>
+      <w:r>
+        <w:t>The Event Loop is Node.js's brain.</w:t>
+      </w:r>
+    </w:p>
+    <w:p>
+      <w:r>
+        <w:t>Imagine a receptionist.</w:t>
+      </w:r>
+    </w:p>
+    <w:p>
+      <w:pPr>
+        <w:rPr>
+          <w:b/>
+          <w:bCs/>
+        </w:rPr>
+      </w:pPr>
+      <w:r>
+        <w:rPr>
+          <w:b/>
+          <w:bCs/>
+        </w:rPr>
+        <w:lastRenderedPageBreak/>
+        <w:t>Traditional Receptionist</w:t>
+      </w:r>
+    </w:p>
+    <w:p>
+      <w:r>
+        <w:t>Customer 1</w:t>
+      </w:r>
+    </w:p>
+    <w:p>
+      <w:r>
+        <w:t>Wait until work finishes</w:t>
+      </w:r>
+    </w:p>
+    <w:p/>
+    <w:p>
+      <w:r>
+        <w:t>Customer 2</w:t>
+      </w:r>
+    </w:p>
+    <w:p>
+      <w:r>
+        <w:t>Wait</w:t>
+      </w:r>
+    </w:p>
+    <w:p/>
+    <w:p>
+      <w:r>
+        <w:t>Customer 3</w:t>
+      </w:r>
+    </w:p>
+    <w:p>
+      <w:r>
+        <w:t>Wait</w:t>
+      </w:r>
+    </w:p>
+    <w:p>
+      <w:r>
+        <w:pict w14:anchorId="0DB357F9">
+          <v:rect id="_x0000_i1217" style="width:0;height:1.5pt" o:hralign="center" o:hrstd="t" o:hr="t" fillcolor="#a0a0a0" stroked="f"/>
+        </w:pict>
+      </w:r>
+    </w:p>
+    <w:p>
+      <w:pPr>
+        <w:rPr>
+          <w:b/>
+          <w:bCs/>
+        </w:rPr>
+      </w:pPr>
+      <w:r>
+        <w:rPr>
+          <w:b/>
+          <w:bCs/>
+        </w:rPr>
+        <w:t>Node.js Receptionist</w:t>
+      </w:r>
+    </w:p>
+    <w:p>
+      <w:r>
+        <w:t>Customer 1</w:t>
+      </w:r>
+    </w:p>
+    <w:p>
+      <w:r>
+        <w:t>Assign task</w:t>
+      </w:r>
+    </w:p>
+    <w:p/>
+    <w:p>
+      <w:r>
+        <w:t>Customer 2</w:t>
+      </w:r>
+    </w:p>
+    <w:p>
+      <w:r>
+        <w:t>Assign task</w:t>
+      </w:r>
+    </w:p>
+    <w:p/>
+    <w:p>
+      <w:r>
+        <w:t>Customer 3</w:t>
+      </w:r>
+    </w:p>
+    <w:p>
+      <w:r>
+        <w:t>Assign task</w:t>
+      </w:r>
+    </w:p>
+    <w:p>
+      <w:r>
+        <w:t>When tasks finish:</w:t>
+      </w:r>
+    </w:p>
+    <w:p>
+      <w:r>
+        <w:t>Notify Customer</w:t>
+      </w:r>
+    </w:p>
+    <w:p>
+      <w:r>
+        <w:t>This is exactly how the Event Loop works.</w:t>
+      </w:r>
+    </w:p>
+    <w:p>
+      <w:r>
+        <w:pict w14:anchorId="3442B483">
+          <v:rect id="_x0000_i1218" style="width:0;height:1.5pt" o:hralign="center" o:hrstd="t" o:hr="t" fillcolor="#a0a0a0" stroked="f"/>
+        </w:pict>
+      </w:r>
+    </w:p>
+    <w:p>
+      <w:pPr>
+        <w:rPr>
+          <w:b/>
+          <w:bCs/>
+        </w:rPr>
+      </w:pPr>
+      <w:r>
+        <w:rPr>
+          <w:b/>
+          <w:bCs/>
+        </w:rPr>
+        <w:t>Real Example: Database Query</w:t>
+      </w:r>
+    </w:p>
+    <w:p>
+      <w:r>
+        <w:t>Suppose a student logs in.</w:t>
+      </w:r>
+    </w:p>
+    <w:p>
+      <w:r>
+        <w:t>Traditional:</w:t>
+      </w:r>
+    </w:p>
+    <w:p>
+      <w:r>
+        <w:t>Receive Login Request</w:t>
+      </w:r>
+    </w:p>
+    <w:p/>
+    <w:p>
+      <w:r>
+        <w:lastRenderedPageBreak/>
+        <w:t>Wait for DB</w:t>
+      </w:r>
+    </w:p>
+    <w:p/>
+    <w:p>
+      <w:r>
+        <w:t>Get Result</w:t>
+      </w:r>
+    </w:p>
+    <w:p/>
+    <w:p>
+      <w:r>
+        <w:t>Process Next User</w:t>
+      </w:r>
+    </w:p>
+    <w:p>
+      <w:r>
+        <w:pict w14:anchorId="7E13E33F">
+          <v:rect id="_x0000_i1219" style="width:0;height:1.5pt" o:hralign="center" o:hrstd="t" o:hr="t" fillcolor="#a0a0a0" stroked="f"/>
+        </w:pict>
+      </w:r>
+    </w:p>
+    <w:p>
+      <w:r>
+        <w:t>Node.js:</w:t>
+      </w:r>
+    </w:p>
+    <w:p>
+      <w:r>
+        <w:t>Receive Login Request</w:t>
+      </w:r>
+    </w:p>
+    <w:p/>
+    <w:p>
+      <w:r>
+        <w:t>Send DB Query</w:t>
+      </w:r>
+    </w:p>
+    <w:p/>
+    <w:p>
+      <w:r>
+        <w:t>Move to Next Request</w:t>
+      </w:r>
+    </w:p>
+    <w:p>
+      <w:r>
+        <w:t>While database works:</w:t>
+      </w:r>
+    </w:p>
+    <w:p>
+      <w:r>
+        <w:t>Node.js handles</w:t>
+      </w:r>
+    </w:p>
+    <w:p>
+      <w:r>
+        <w:t>other users</w:t>
+      </w:r>
+    </w:p>
+    <w:p>
+      <w:r>
+        <w:t>When DB returns:</w:t>
+      </w:r>
+    </w:p>
+    <w:p>
+      <w:r>
+        <w:t>Event Loop receives result</w:t>
+      </w:r>
+    </w:p>
+    <w:p/>
+    <w:p>
+      <w:r>
+        <w:t>Send response</w:t>
+      </w:r>
+    </w:p>
+    <w:p>
+      <w:r>
+        <w:pict w14:anchorId="5C01EA09">
+          <v:rect id="_x0000_i1220" style="width:0;height:1.5pt" o:hralign="center" o:hrstd="t" o:hr="t" fillcolor="#a0a0a0" stroked="f"/>
+        </w:pict>
+      </w:r>
+    </w:p>
+    <w:p>
+      <w:pPr>
+        <w:rPr>
+          <w:b/>
+          <w:bCs/>
+        </w:rPr>
+      </w:pPr>
+      <w:r>
+        <w:rPr>
+          <w:b/>
+          <w:bCs/>
+        </w:rPr>
+        <w:t>Internal Architecture</w:t>
+      </w:r>
+    </w:p>
+    <w:p>
+      <w:r>
+        <w:t>User Request</w:t>
+      </w:r>
+    </w:p>
+    <w:p>
+      <w:r>
+        <w:t xml:space="preserve">      ↓</w:t>
+      </w:r>
+    </w:p>
+    <w:p>
+      <w:r>
+        <w:t>Node.js</w:t>
+      </w:r>
+    </w:p>
+    <w:p>
+      <w:r>
+        <w:t xml:space="preserve">      ↓</w:t>
+      </w:r>
+    </w:p>
+    <w:p>
+      <w:r>
+        <w:t>Event Loop</w:t>
+      </w:r>
+    </w:p>
+    <w:p>
+      <w:r>
+        <w:t xml:space="preserve">      ↓</w:t>
+      </w:r>
+    </w:p>
+    <w:p>
+      <w:r>
+        <w:t>Thread Pool / OS</w:t>
+      </w:r>
+    </w:p>
+    <w:p>
+      <w:r>
+        <w:lastRenderedPageBreak/>
+        <w:t xml:space="preserve">      ↓</w:t>
+      </w:r>
+    </w:p>
+    <w:p>
+      <w:r>
+        <w:t>Database / File System</w:t>
+      </w:r>
+    </w:p>
+    <w:p>
+      <w:r>
+        <w:t xml:space="preserve">      ↓</w:t>
+      </w:r>
+    </w:p>
+    <w:p>
+      <w:r>
+        <w:t>Result</w:t>
+      </w:r>
+    </w:p>
+    <w:p>
+      <w:r>
+        <w:t xml:space="preserve">      ↓</w:t>
+      </w:r>
+    </w:p>
+    <w:p>
+      <w:r>
+        <w:t>Event Loop</w:t>
+      </w:r>
+    </w:p>
+    <w:p>
+      <w:r>
+        <w:t xml:space="preserve">      ↓</w:t>
+      </w:r>
+    </w:p>
+    <w:p>
+      <w:r>
+        <w:t>Response</w:t>
+      </w:r>
+    </w:p>
+    <w:p>
+      <w:r>
+        <w:pict w14:anchorId="507C48BD">
+          <v:rect id="_x0000_i1221" style="width:0;height:1.5pt" o:hralign="center" o:hrstd="t" o:hr="t" fillcolor="#a0a0a0" stroked="f"/>
+        </w:pict>
+      </w:r>
+    </w:p>
+    <w:p>
+      <w:pPr>
+        <w:rPr>
+          <w:b/>
+          <w:bCs/>
+        </w:rPr>
+      </w:pPr>
+      <w:r>
+        <w:rPr>
+          <w:b/>
+          <w:bCs/>
+        </w:rPr>
+        <w:t>Why Is Node.js Fast?</w:t>
+      </w:r>
+    </w:p>
+    <w:p>
+      <w:r>
+        <w:t>Not because JavaScript is magically faster.</w:t>
+      </w:r>
+    </w:p>
+    <w:p>
+      <w:r>
+        <w:t>It is fast because:</w:t>
+      </w:r>
+    </w:p>
+    <w:p>
+      <w:pPr>
+        <w:rPr>
+          <w:b/>
+          <w:bCs/>
+        </w:rPr>
+      </w:pPr>
+      <w:r>
+        <w:rPr>
+          <w:b/>
+          <w:bCs/>
+        </w:rPr>
+        <w:t>1. V8 Engine</w:t>
+      </w:r>
+    </w:p>
+    <w:p>
+      <w:r>
+        <w:t>Uses Google's V8 JavaScript engine.</w:t>
+      </w:r>
+    </w:p>
+    <w:p>
+      <w:r>
+        <w:t>JavaScript</w:t>
+      </w:r>
+    </w:p>
+    <w:p>
+      <w:r>
+        <w:t xml:space="preserve">    ↓</w:t>
+      </w:r>
+    </w:p>
+    <w:p>
+      <w:r>
+        <w:t>Machine Code</w:t>
+      </w:r>
+    </w:p>
+    <w:p>
+      <w:r>
+        <w:t>Very efficient execution.</w:t>
+      </w:r>
+    </w:p>
+    <w:p>
+      <w:r>
+        <w:pict w14:anchorId="4AFF62F6">
+          <v:rect id="_x0000_i1222" style="width:0;height:1.5pt" o:hralign="center" o:hrstd="t" o:hr="t" fillcolor="#a0a0a0" stroked="f"/>
+        </w:pict>
+      </w:r>
+    </w:p>
+    <w:p>
+      <w:pPr>
+        <w:rPr>
+          <w:b/>
+          <w:bCs/>
+        </w:rPr>
+      </w:pPr>
+      <w:r>
+        <w:rPr>
+          <w:b/>
+          <w:bCs/>
+        </w:rPr>
+        <w:t>2. Non-Blocking Operations</w:t>
+      </w:r>
+    </w:p>
+    <w:p>
+      <w:r>
+        <w:t>Instead of waiting:</w:t>
+      </w:r>
+    </w:p>
+    <w:p>
+      <w:r>
+        <w:t>Read File</w:t>
+      </w:r>
+    </w:p>
+    <w:p>
+      <w:r>
+        <w:t>WAIT</w:t>
+      </w:r>
+    </w:p>
+    <w:p>
+      <w:r>
+        <w:t>Node.js:</w:t>
+      </w:r>
+    </w:p>
+    <w:p>
+      <w:r>
+        <w:t>Read File</w:t>
+      </w:r>
+    </w:p>
+    <w:p>
+      <w:r>
+        <w:t>Continue Working</w:t>
+      </w:r>
+    </w:p>
+    <w:p>
+      <w:r>
+        <w:pict w14:anchorId="42844B36">
+          <v:rect id="_x0000_i1223" style="width:0;height:1.5pt" o:hralign="center" o:hrstd="t" o:hr="t" fillcolor="#a0a0a0" stroked="f"/>
+        </w:pict>
+      </w:r>
+    </w:p>
+    <w:p>
+      <w:pPr>
+        <w:rPr>
+          <w:b/>
+          <w:bCs/>
+        </w:rPr>
+      </w:pPr>
+      <w:r>
+        <w:rPr>
+          <w:b/>
+          <w:bCs/>
+        </w:rPr>
+        <w:t>3. Event Loop</w:t>
+      </w:r>
+    </w:p>
+    <w:p>
+      <w:r>
+        <w:lastRenderedPageBreak/>
+        <w:t>Handles thousands of connections efficiently.</w:t>
+      </w:r>
+    </w:p>
+    <w:p>
+      <w:r>
+        <w:pict w14:anchorId="68463A45">
+          <v:rect id="_x0000_i1224" style="width:0;height:1.5pt" o:hralign="center" o:hrstd="t" o:hr="t" fillcolor="#a0a0a0" stroked="f"/>
+        </w:pict>
+      </w:r>
+    </w:p>
+    <w:p>
+      <w:pPr>
+        <w:rPr>
+          <w:b/>
+          <w:bCs/>
+        </w:rPr>
+      </w:pPr>
+      <w:r>
+        <w:rPr>
+          <w:b/>
+          <w:bCs/>
+        </w:rPr>
+        <w:t>What Is Express.js?</w:t>
+      </w:r>
+    </w:p>
+    <w:p>
+      <w:r>
+        <w:t>When using Node.js, developers commonly use:</w:t>
+      </w:r>
+    </w:p>
+    <w:p>
+      <w:r>
+        <w:t>Express.js</w:t>
+      </w:r>
+    </w:p>
+    <w:p>
+      <w:r>
+        <w:t>Node.js alone:</w:t>
+      </w:r>
+    </w:p>
+    <w:p>
+      <w:proofErr w:type="spellStart"/>
+      <w:r>
+        <w:t>const</w:t>
+      </w:r>
+      <w:proofErr w:type="spellEnd"/>
+      <w:r>
+        <w:t xml:space="preserve"> http = require("http");</w:t>
+      </w:r>
+    </w:p>
+    <w:p>
+      <w:r>
+        <w:t>Lots of manual work.</w:t>
+      </w:r>
+    </w:p>
+    <w:p>
+      <w:r>
+        <w:t>Express.js simplifies development.</w:t>
+      </w:r>
+    </w:p>
+    <w:p>
+      <w:proofErr w:type="spellStart"/>
+      <w:proofErr w:type="gramStart"/>
+      <w:r>
+        <w:t>app.get</w:t>
+      </w:r>
+      <w:proofErr w:type="spellEnd"/>
+      <w:r>
+        <w:t>(</w:t>
+      </w:r>
+      <w:proofErr w:type="gramEnd"/>
+      <w:r>
+        <w:t>"/students", (</w:t>
+      </w:r>
+      <w:proofErr w:type="spellStart"/>
+      <w:r>
+        <w:t>req</w:t>
+      </w:r>
+      <w:proofErr w:type="spellEnd"/>
+      <w:r>
+        <w:t>, res) =&gt; {</w:t>
+      </w:r>
+    </w:p>
+    <w:p>
+      <w:r>
+        <w:t xml:space="preserve">   </w:t>
+      </w:r>
+      <w:proofErr w:type="spellStart"/>
+      <w:proofErr w:type="gramStart"/>
+      <w:r>
+        <w:t>res.send</w:t>
+      </w:r>
+      <w:proofErr w:type="spellEnd"/>
+      <w:proofErr w:type="gramEnd"/>
+      <w:r>
+        <w:t>("Students Data");</w:t>
+      </w:r>
+    </w:p>
+    <w:p>
+      <w:r>
+        <w:t>});</w:t>
+      </w:r>
+    </w:p>
+    <w:p>
+      <w:r>
+        <w:t>Much easier.</w:t>
+      </w:r>
+    </w:p>
+    <w:p>
+      <w:r>
+        <w:pict w14:anchorId="6936593B">
+          <v:rect id="_x0000_i1225" style="width:0;height:1.5pt" o:hralign="center" o:hrstd="t" o:hr="t" fillcolor="#a0a0a0" stroked="f"/>
+        </w:pict>
+      </w:r>
+    </w:p>
+    <w:p>
+      <w:pPr>
+        <w:rPr>
+          <w:b/>
+          <w:bCs/>
+        </w:rPr>
+      </w:pPr>
+      <w:r>
+        <w:rPr>
+          <w:b/>
+          <w:bCs/>
+        </w:rPr>
+        <w:t>How Node.js Works in a MERN Project</w:t>
+      </w:r>
+    </w:p>
+    <w:p>
+      <w:r>
+        <w:t>For your Placement360 project:</w:t>
+      </w:r>
+    </w:p>
+    <w:p>
+      <w:pPr>
+        <w:rPr>
+          <w:b/>
+          <w:bCs/>
+        </w:rPr>
+      </w:pPr>
+      <w:r>
+        <w:rPr>
+          <w:b/>
+          <w:bCs/>
+        </w:rPr>
+        <w:t>M = MongoDB</w:t>
+      </w:r>
+    </w:p>
+    <w:p>
+      <w:r>
+        <w:t>Database</w:t>
+      </w:r>
+    </w:p>
+    <w:p>
+      <w:pPr>
+        <w:rPr>
+          <w:b/>
+          <w:bCs/>
+        </w:rPr>
+      </w:pPr>
+      <w:r>
+        <w:rPr>
+          <w:b/>
+          <w:bCs/>
+        </w:rPr>
+        <w:t>E = Express.js</w:t>
+      </w:r>
+    </w:p>
+    <w:p>
+      <w:r>
+        <w:t>Backend framework</w:t>
+      </w:r>
+    </w:p>
+    <w:p>
+      <w:pPr>
+        <w:rPr>
+          <w:b/>
+          <w:bCs/>
+        </w:rPr>
+      </w:pPr>
+      <w:r>
+        <w:rPr>
+          <w:b/>
+          <w:bCs/>
+        </w:rPr>
+        <w:t>R = React</w:t>
+      </w:r>
+    </w:p>
+    <w:p>
+      <w:r>
+        <w:t>Frontend</w:t>
+      </w:r>
+    </w:p>
+    <w:p>
+      <w:pPr>
+        <w:rPr>
+          <w:b/>
+          <w:bCs/>
+        </w:rPr>
+      </w:pPr>
+      <w:r>
+        <w:rPr>
+          <w:b/>
+          <w:bCs/>
+        </w:rPr>
+        <w:t>N = Node.js</w:t>
+      </w:r>
+    </w:p>
+    <w:p>
+      <w:r>
+        <w:t>Runtime environment</w:t>
+      </w:r>
+    </w:p>
+    <w:p>
+      <w:r>
+        <w:t>Architecture:</w:t>
+      </w:r>
+    </w:p>
+    <w:p>
+      <w:r>
+        <w:t>Student</w:t>
+      </w:r>
+    </w:p>
+    <w:p>
+      <w:r>
+        <w:t xml:space="preserve">   ↓</w:t>
+      </w:r>
+    </w:p>
+    <w:p>
+      <w:r>
+        <w:t>React Frontend</w:t>
+      </w:r>
+    </w:p>
+    <w:p>
+      <w:r>
+        <w:lastRenderedPageBreak/>
+        <w:t xml:space="preserve">   ↓</w:t>
+      </w:r>
+    </w:p>
+    <w:p>
+      <w:r>
+        <w:t>API Request</w:t>
+      </w:r>
+    </w:p>
+    <w:p>
+      <w:r>
+        <w:t xml:space="preserve">   ↓</w:t>
+      </w:r>
+    </w:p>
+    <w:p>
+      <w:r>
+        <w:t>Express.js</w:t>
+      </w:r>
+    </w:p>
+    <w:p>
+      <w:r>
+        <w:t xml:space="preserve">   ↓</w:t>
+      </w:r>
+    </w:p>
+    <w:p>
+      <w:r>
+        <w:t>Node.js Runtime</w:t>
+      </w:r>
+    </w:p>
+    <w:p>
+      <w:r>
+        <w:t xml:space="preserve">   ↓</w:t>
+      </w:r>
+    </w:p>
+    <w:p>
+      <w:r>
+        <w:t>MongoDB</w:t>
+      </w:r>
+    </w:p>
+    <w:p>
+      <w:r>
+        <w:t xml:space="preserve">   ↓</w:t>
+      </w:r>
+    </w:p>
+    <w:p>
+      <w:r>
+        <w:t>Node.js</w:t>
+      </w:r>
+    </w:p>
+    <w:p>
+      <w:r>
+        <w:t xml:space="preserve">   ↓</w:t>
+      </w:r>
+    </w:p>
+    <w:p>
+      <w:r>
+        <w:t>React</w:t>
+      </w:r>
+    </w:p>
+    <w:p>
+      <w:r>
+        <w:t xml:space="preserve">   ↓</w:t>
+      </w:r>
+    </w:p>
+    <w:p>
+      <w:r>
+        <w:t>Student</w:t>
+      </w:r>
+    </w:p>
+    <w:p>
+      <w:r>
+        <w:pict w14:anchorId="650A2969">
+          <v:rect id="_x0000_i1226" style="width:0;height:1.5pt" o:hralign="center" o:hrstd="t" o:hr="t" fillcolor="#a0a0a0" stroked="f"/>
+        </w:pict>
+      </w:r>
+    </w:p>
+    <w:p>
+      <w:pPr>
+        <w:rPr>
+          <w:b/>
+          <w:bCs/>
+        </w:rPr>
+      </w:pPr>
+      <w:r>
+        <w:rPr>
+          <w:b/>
+          <w:bCs/>
+        </w:rPr>
+        <w:t>Example Flow: Student Applies for Job</w:t>
+      </w:r>
+    </w:p>
+    <w:p>
+      <w:pPr>
+        <w:rPr>
+          <w:b/>
+          <w:bCs/>
+        </w:rPr>
+      </w:pPr>
+      <w:r>
+        <w:rPr>
+          <w:b/>
+          <w:bCs/>
+        </w:rPr>
+        <w:t>Step 1</w:t>
+      </w:r>
+    </w:p>
+    <w:p>
+      <w:r>
+        <w:t>Student clicks:</w:t>
+      </w:r>
+    </w:p>
+    <w:p>
+      <w:r>
+        <w:t>Apply Job</w:t>
+      </w:r>
+    </w:p>
+    <w:p>
+      <w:r>
+        <w:pict w14:anchorId="51E3A072">
+          <v:rect id="_x0000_i1227" style="width:0;height:1.5pt" o:hralign="center" o:hrstd="t" o:hr="t" fillcolor="#a0a0a0" stroked="f"/>
+        </w:pict>
+      </w:r>
+    </w:p>
+    <w:p>
+      <w:pPr>
+        <w:rPr>
+          <w:b/>
+          <w:bCs/>
+        </w:rPr>
+      </w:pPr>
+      <w:r>
+        <w:rPr>
+          <w:b/>
+          <w:bCs/>
+        </w:rPr>
+        <w:t>Step 2</w:t>
+      </w:r>
+    </w:p>
+    <w:p>
+      <w:r>
+        <w:t>React sends request:</w:t>
+      </w:r>
+    </w:p>
+    <w:p>
+      <w:r>
+        <w:t>POST /apply-job</w:t>
+      </w:r>
+    </w:p>
+    <w:p>
+      <w:r>
+        <w:pict w14:anchorId="248F268F">
+          <v:rect id="_x0000_i1228" style="width:0;height:1.5pt" o:hralign="center" o:hrstd="t" o:hr="t" fillcolor="#a0a0a0" stroked="f"/>
+        </w:pict>
+      </w:r>
+    </w:p>
+    <w:p>
+      <w:pPr>
+        <w:rPr>
+          <w:b/>
+          <w:bCs/>
+        </w:rPr>
+      </w:pPr>
+      <w:r>
+        <w:rPr>
+          <w:b/>
+          <w:bCs/>
+        </w:rPr>
+        <w:t>Step 3</w:t>
+      </w:r>
+    </w:p>
+    <w:p>
+      <w:r>
+        <w:t>Node.js receives request.</w:t>
+      </w:r>
+    </w:p>
+    <w:p>
+      <w:proofErr w:type="spellStart"/>
+      <w:r>
+        <w:t>app.post</w:t>
+      </w:r>
+      <w:proofErr w:type="spellEnd"/>
+      <w:r>
+        <w:t>("/apply-job")</w:t>
+      </w:r>
+    </w:p>
+    <w:p>
+      <w:r>
+        <w:pict w14:anchorId="22C6FA11">
+          <v:rect id="_x0000_i1229" style="width:0;height:1.5pt" o:hralign="center" o:hrstd="t" o:hr="t" fillcolor="#a0a0a0" stroked="f"/>
+        </w:pict>
+      </w:r>
+    </w:p>
+    <w:p>
+      <w:pPr>
+        <w:rPr>
+          <w:b/>
+          <w:bCs/>
+        </w:rPr>
+      </w:pPr>
+      <w:r>
+        <w:rPr>
+          <w:b/>
+          <w:bCs/>
+        </w:rPr>
+        <w:lastRenderedPageBreak/>
+        <w:t>Step 4</w:t>
+      </w:r>
+    </w:p>
+    <w:p>
+      <w:r>
+        <w:t>Node.js validates data.</w:t>
+      </w:r>
+    </w:p>
+    <w:p>
+      <w:r>
+        <w:t>Check Student</w:t>
+      </w:r>
+    </w:p>
+    <w:p>
+      <w:r>
+        <w:t>Check Eligibility</w:t>
+      </w:r>
+    </w:p>
+    <w:p>
+      <w:r>
+        <w:t>Check Job</w:t>
+      </w:r>
+    </w:p>
+    <w:p>
+      <w:r>
+        <w:pict w14:anchorId="467427E8">
+          <v:rect id="_x0000_i1230" style="width:0;height:1.5pt" o:hralign="center" o:hrstd="t" o:hr="t" fillcolor="#a0a0a0" stroked="f"/>
+        </w:pict>
+      </w:r>
+    </w:p>
+    <w:p>
+      <w:pPr>
+        <w:rPr>
+          <w:b/>
+          <w:bCs/>
+        </w:rPr>
+      </w:pPr>
+      <w:r>
+        <w:rPr>
+          <w:b/>
+          <w:bCs/>
+        </w:rPr>
+        <w:t>Step 5</w:t>
+      </w:r>
+    </w:p>
+    <w:p>
+      <w:r>
+        <w:t>Node.js stores data.</w:t>
+      </w:r>
+    </w:p>
+    <w:p>
+      <w:r>
+        <w:t>MongoDB</w:t>
+      </w:r>
+    </w:p>
+    <w:p>
+      <w:r>
+        <w:t>Applications Collection</w:t>
+      </w:r>
+    </w:p>
+    <w:p>
+      <w:r>
+        <w:pict w14:anchorId="712BBEED">
+          <v:rect id="_x0000_i1231" style="width:0;height:1.5pt" o:hralign="center" o:hrstd="t" o:hr="t" fillcolor="#a0a0a0" stroked="f"/>
+        </w:pict>
+      </w:r>
+    </w:p>
+    <w:p>
+      <w:pPr>
+        <w:rPr>
+          <w:b/>
+          <w:bCs/>
+        </w:rPr>
+      </w:pPr>
+      <w:r>
+        <w:rPr>
+          <w:b/>
+          <w:bCs/>
+        </w:rPr>
+        <w:t>Step 6</w:t>
+      </w:r>
+    </w:p>
+    <w:p>
+      <w:r>
+        <w:t>Node.js sends response.</w:t>
+      </w:r>
+    </w:p>
+    <w:p>
+      <w:r>
+        <w:t>{</w:t>
+      </w:r>
+    </w:p>
+    <w:p>
+      <w:r>
+        <w:t xml:space="preserve">  "success": true</w:t>
+      </w:r>
+    </w:p>
+    <w:p>
+      <w:r>
+        <w:t>}</w:t>
+      </w:r>
+    </w:p>
+    <w:p>
+      <w:r>
+        <w:pict w14:anchorId="36488D86">
+          <v:rect id="_x0000_i1232" style="width:0;height:1.5pt" o:hralign="center" o:hrstd="t" o:hr="t" fillcolor="#a0a0a0" stroked="f"/>
+        </w:pict>
+      </w:r>
+    </w:p>
+    <w:p>
+      <w:pPr>
+        <w:rPr>
+          <w:b/>
+          <w:bCs/>
+        </w:rPr>
+      </w:pPr>
+      <w:r>
+        <w:rPr>
+          <w:b/>
+          <w:bCs/>
+        </w:rPr>
+        <w:t>Step 7</w:t>
+      </w:r>
+    </w:p>
+    <w:p>
+      <w:r>
+        <w:t>React updates UI.</w:t>
+      </w:r>
+    </w:p>
+    <w:p>
+      <w:r>
+        <w:t>Application Submitted Successfully</w:t>
+      </w:r>
+    </w:p>
+    <w:p>
+      <w:r>
+        <w:pict w14:anchorId="186A183C">
+          <v:rect id="_x0000_i1233" style="width:0;height:1.5pt" o:hralign="center" o:hrstd="t" o:hr="t" fillcolor="#a0a0a0" stroked="f"/>
+        </w:pict>
+      </w:r>
+    </w:p>
+    <w:p>
+      <w:pPr>
+        <w:rPr>
+          <w:b/>
+          <w:bCs/>
+        </w:rPr>
+      </w:pPr>
+      <w:r>
+        <w:rPr>
+          <w:b/>
+          <w:bCs/>
+        </w:rPr>
+        <w:t>Why Companies Love Node.js</w:t>
+      </w:r>
+    </w:p>
+    <w:p>
+      <w:r>
+        <w:t>Many large platforms use Node.js for parts of their systems:</w:t>
+      </w:r>
+    </w:p>
+    <w:p>
+      <w:pPr>
+        <w:numPr>
+          <w:ilvl w:val="0"/>
+          <w:numId w:val="4"/>
+        </w:numPr>
+      </w:pPr>
+      <w:r>
+        <w:t>Netflix</w:t>
+      </w:r>
+    </w:p>
+    <w:p>
+      <w:pPr>
+        <w:numPr>
+          <w:ilvl w:val="0"/>
+          <w:numId w:val="4"/>
+        </w:numPr>
+      </w:pPr>
+      <w:r>
+        <w:t>LinkedIn</w:t>
+      </w:r>
+    </w:p>
+    <w:p>
+      <w:pPr>
+        <w:numPr>
+          <w:ilvl w:val="0"/>
+          <w:numId w:val="4"/>
+        </w:numPr>
+      </w:pPr>
+      <w:r>
+        <w:t>PayPal</w:t>
+      </w:r>
+    </w:p>
+    <w:p>
+      <w:pPr>
+        <w:numPr>
+          <w:ilvl w:val="0"/>
+          <w:numId w:val="4"/>
+        </w:numPr>
+      </w:pPr>
+      <w:r>
+        <w:t>Uber</w:t>
+      </w:r>
+    </w:p>
+    <w:p>
+      <w:r>
+        <w:t>Reasons:</w:t>
+      </w:r>
+    </w:p>
+    <w:p>
+      <w:r>
+        <w:rPr>
+          <w:rFonts w:ascii="Segoe UI Emoji" w:hAnsi="Segoe UI Emoji" w:cs="Segoe UI Emoji"/>
+        </w:rPr>
+        <w:lastRenderedPageBreak/>
+        <w:t>✅</w:t>
+      </w:r>
+      <w:r>
+        <w:t xml:space="preserve"> One language everywhere</w:t>
+      </w:r>
+      <w:r>
+        <w:br/>
+      </w:r>
+      <w:r>
+        <w:rPr>
+          <w:rFonts w:ascii="Segoe UI Emoji" w:hAnsi="Segoe UI Emoji" w:cs="Segoe UI Emoji"/>
+        </w:rPr>
+        <w:t>✅</w:t>
+      </w:r>
+      <w:r>
+        <w:t xml:space="preserve"> Fast development</w:t>
+      </w:r>
+      <w:r>
+        <w:br/>
+      </w:r>
+      <w:r>
+        <w:rPr>
+          <w:rFonts w:ascii="Segoe UI Emoji" w:hAnsi="Segoe UI Emoji" w:cs="Segoe UI Emoji"/>
+        </w:rPr>
+        <w:t>✅</w:t>
+      </w:r>
+      <w:r>
+        <w:t xml:space="preserve"> Huge </w:t>
+      </w:r>
+      <w:proofErr w:type="spellStart"/>
+      <w:r>
+        <w:t>npm</w:t>
+      </w:r>
+      <w:proofErr w:type="spellEnd"/>
+      <w:r>
+        <w:t xml:space="preserve"> ecosystem</w:t>
+      </w:r>
+      <w:r>
+        <w:br/>
+      </w:r>
+      <w:r>
+        <w:rPr>
+          <w:rFonts w:ascii="Segoe UI Emoji" w:hAnsi="Segoe UI Emoji" w:cs="Segoe UI Emoji"/>
+        </w:rPr>
+        <w:t>✅</w:t>
+      </w:r>
+      <w:r>
+        <w:t xml:space="preserve"> Excellent for APIs</w:t>
+      </w:r>
+      <w:r>
+        <w:br/>
+      </w:r>
+      <w:r>
+        <w:rPr>
+          <w:rFonts w:ascii="Segoe UI Emoji" w:hAnsi="Segoe UI Emoji" w:cs="Segoe UI Emoji"/>
+        </w:rPr>
+        <w:t>✅</w:t>
+      </w:r>
+      <w:r>
+        <w:t xml:space="preserve"> Excellent for real-time applications</w:t>
+      </w:r>
+      <w:r>
+        <w:br/>
+      </w:r>
+      <w:r>
+        <w:rPr>
+          <w:rFonts w:ascii="Segoe UI Emoji" w:hAnsi="Segoe UI Emoji" w:cs="Segoe UI Emoji"/>
+        </w:rPr>
+        <w:t>✅</w:t>
+      </w:r>
+      <w:r>
+        <w:t xml:space="preserve"> Large developer community</w:t>
+      </w:r>
+    </w:p>
+    <w:p>
+      <w:r>
+        <w:pict w14:anchorId="3930855F">
+          <v:rect id="_x0000_i1234" style="width:0;height:1.5pt" o:hralign="center" o:hrstd="t" o:hr="t" fillcolor="#a0a0a0" stroked="f"/>
+        </w:pict>
+      </w:r>
+    </w:p>
+    <w:p>
+      <w:pPr>
+        <w:rPr>
+          <w:b/>
+          <w:bCs/>
+        </w:rPr>
+      </w:pPr>
+      <w:r>
+        <w:rPr>
+          <w:b/>
+          <w:bCs/>
+        </w:rPr>
+        <w:t>In One Sentence</w:t>
+      </w:r>
+    </w:p>
+    <w:p>
+      <w:r>
+        <w:rPr>
+          <w:b/>
+          <w:bCs/>
+        </w:rPr>
+        <w:t>Node.js is a server-side JavaScript runtime that revolutionized web development by allowing developers to use JavaScript for both frontend and backend, while efficiently handling thousands of concurrent requests through its event-driven, non-blocking architecture.</w:t>
+      </w:r>
+    </w:p>
+    <w:p>
+      <w:pPr>
+        <w:rPr>
+          <w:lang w:val="en-US"/>
+        </w:rPr>
+      </w:pPr>
+    </w:p>
     <w:sectPr>
       <w:pgSz w:w="11906" w:h="16838"/>
       <w:pgMar w:top="1440" w:right="1440" w:bottom="1440" w:left="1440" w:header="708" w:footer="708" w:gutter="0"/>
@@ -78,6 +2652,619 @@
     </w:sectPr>
   </w:body>
 </w:document>
+</file>
+
+<file path=word/numbering.xml><?xml version="1.0" encoding="utf-8"?>
+<w:numbering xmlns:wpc="http://schemas.microsoft.com/office/word/2010/wordprocessingCanvas" xmlns:cx="http://schemas.microsoft.com/office/drawing/2014/chartex" xmlns:cx1="http://schemas.microsoft.com/office/drawing/2015/9/8/chartex" xmlns:cx2="http://schemas.microsoft.com/office/drawing/2015/10/21/chartex" xmlns:cx3="http://schemas.microsoft.com/office/drawing/2016/5/9/chartex" xmlns:cx4="http://schemas.microsoft.com/office/drawing/2016/5/10/chartex" xmlns:cx5="http://schemas.microsoft.com/office/drawing/2016/5/11/chartex" xmlns:cx6="http://schemas.microsoft.com/office/drawing/2016/5/12/chartex" xmlns:cx7="http://schemas.microsoft.com/office/drawing/2016/5/13/chartex" xmlns:cx8="http://schemas.microsoft.com/office/drawing/2016/5/14/chartex" xmlns:mc="http://schemas.openxmlformats.org/markup-compatibility/2006" xmlns:aink="http://schemas.microsoft.com/office/drawing/2016/ink" xmlns:am3d="http://schemas.microsoft.com/office/drawing/2017/model3d" xmlns:o="urn:schemas-microsoft-com:office:office" xmlns:oel="http://schemas.microsoft.com/office/2019/extlst" xmlns:r="http://schemas.openxmlformats.org/officeDocument/2006/relationships" xmlns:m="http://schemas.openxmlformats.org/officeDocument/2006/math" xmlns:v="urn:schemas-microsoft-com:vml" xmlns:wp14="http://schemas.microsoft.com/office/word/2010/wordprocessingDrawing" xmlns:wp="http://schemas.openxmlformats.org/drawingml/2006/wordprocessingDrawing" xmlns:w10="urn:schemas-microsoft-com:office:word" xmlns:w="http://schemas.openxmlformats.org/wordprocessingml/2006/main" xmlns:w14="http://schemas.microsoft.com/office/word/2010/wordml" xmlns:w15="http://schemas.microsoft.com/office/word/2012/wordml" xmlns:w16cex="http://schemas.microsoft.com/office/word/2018/wordml/cex" xmlns:w16cid="http://schemas.microsoft.com/office/word/2016/wordml/cid" xmlns:w16="http://schemas.microsoft.com/office/word/2018/wordml" xmlns:w16sdtdh="http://schemas.microsoft.com/office/word/2020/wordml/sdtdatahash" xmlns:w16se="http://schemas.microsoft.com/office/word/2015/wordml/symex" xmlns:wpg="http://schemas.microsoft.com/office/word/2010/wordprocessingGroup" xmlns:wpi="http://schemas.microsoft.com/office/word/2010/wordprocessingInk" xmlns:wne="http://schemas.microsoft.com/office/word/2006/wordml" xmlns:wps="http://schemas.microsoft.com/office/word/2010/wordprocessingShape" mc:Ignorable="w14 w15 w16se w16cid w16 w16cex w16sdtdh wp14">
+  <w:abstractNum w:abstractNumId="0" w15:restartNumberingAfterBreak="0">
+    <w:nsid w:val="064400DB"/>
+    <w:multiLevelType w:val="multilevel"/>
+    <w:tmpl w:val="E9CA6DA0"/>
+    <w:lvl w:ilvl="0">
+      <w:start w:val="1"/>
+      <w:numFmt w:val="bullet"/>
+      <w:lvlText w:val=""/>
+      <w:lvlJc w:val="left"/>
+      <w:pPr>
+        <w:tabs>
+          <w:tab w:val="num" w:pos="720"/>
+        </w:tabs>
+        <w:ind w:left="720" w:hanging="360"/>
+      </w:pPr>
+      <w:rPr>
+        <w:rFonts w:ascii="Symbol" w:hAnsi="Symbol" w:hint="default"/>
+        <w:sz w:val="20"/>
+      </w:rPr>
+    </w:lvl>
+    <w:lvl w:ilvl="1" w:tentative="1">
+      <w:start w:val="1"/>
+      <w:numFmt w:val="bullet"/>
+      <w:lvlText w:val="o"/>
+      <w:lvlJc w:val="left"/>
+      <w:pPr>
+        <w:tabs>
+          <w:tab w:val="num" w:pos="1440"/>
+        </w:tabs>
+        <w:ind w:left="1440" w:hanging="360"/>
+      </w:pPr>
+      <w:rPr>
+        <w:rFonts w:ascii="Courier New" w:hAnsi="Courier New" w:hint="default"/>
+        <w:sz w:val="20"/>
+      </w:rPr>
+    </w:lvl>
+    <w:lvl w:ilvl="2" w:tentative="1">
+      <w:start w:val="1"/>
+      <w:numFmt w:val="bullet"/>
+      <w:lvlText w:val=""/>
+      <w:lvlJc w:val="left"/>
+      <w:pPr>
+        <w:tabs>
+          <w:tab w:val="num" w:pos="2160"/>
+        </w:tabs>
+        <w:ind w:left="2160" w:hanging="360"/>
+      </w:pPr>
+      <w:rPr>
+        <w:rFonts w:ascii="Wingdings" w:hAnsi="Wingdings" w:hint="default"/>
+        <w:sz w:val="20"/>
+      </w:rPr>
+    </w:lvl>
+    <w:lvl w:ilvl="3" w:tentative="1">
+      <w:start w:val="1"/>
+      <w:numFmt w:val="bullet"/>
+      <w:lvlText w:val=""/>
+      <w:lvlJc w:val="left"/>
+      <w:pPr>
+        <w:tabs>
+          <w:tab w:val="num" w:pos="2880"/>
+        </w:tabs>
+        <w:ind w:left="2880" w:hanging="360"/>
+      </w:pPr>
+      <w:rPr>
+        <w:rFonts w:ascii="Wingdings" w:hAnsi="Wingdings" w:hint="default"/>
+        <w:sz w:val="20"/>
+      </w:rPr>
+    </w:lvl>
+    <w:lvl w:ilvl="4" w:tentative="1">
+      <w:start w:val="1"/>
+      <w:numFmt w:val="bullet"/>
+      <w:lvlText w:val=""/>
+      <w:lvlJc w:val="left"/>
+      <w:pPr>
+        <w:tabs>
+          <w:tab w:val="num" w:pos="3600"/>
+        </w:tabs>
+        <w:ind w:left="3600" w:hanging="360"/>
+      </w:pPr>
+      <w:rPr>
+        <w:rFonts w:ascii="Wingdings" w:hAnsi="Wingdings" w:hint="default"/>
+        <w:sz w:val="20"/>
+      </w:rPr>
+    </w:lvl>
+    <w:lvl w:ilvl="5" w:tentative="1">
+      <w:start w:val="1"/>
+      <w:numFmt w:val="bullet"/>
+      <w:lvlText w:val=""/>
+      <w:lvlJc w:val="left"/>
+      <w:pPr>
+        <w:tabs>
+          <w:tab w:val="num" w:pos="4320"/>
+        </w:tabs>
+        <w:ind w:left="4320" w:hanging="360"/>
+      </w:pPr>
+      <w:rPr>
+        <w:rFonts w:ascii="Wingdings" w:hAnsi="Wingdings" w:hint="default"/>
+        <w:sz w:val="20"/>
+      </w:rPr>
+    </w:lvl>
+    <w:lvl w:ilvl="6" w:tentative="1">
+      <w:start w:val="1"/>
+      <w:numFmt w:val="bullet"/>
+      <w:lvlText w:val=""/>
+      <w:lvlJc w:val="left"/>
+      <w:pPr>
+        <w:tabs>
+          <w:tab w:val="num" w:pos="5040"/>
+        </w:tabs>
+        <w:ind w:left="5040" w:hanging="360"/>
+      </w:pPr>
+      <w:rPr>
+        <w:rFonts w:ascii="Wingdings" w:hAnsi="Wingdings" w:hint="default"/>
+        <w:sz w:val="20"/>
+      </w:rPr>
+    </w:lvl>
+    <w:lvl w:ilvl="7" w:tentative="1">
+      <w:start w:val="1"/>
+      <w:numFmt w:val="bullet"/>
+      <w:lvlText w:val=""/>
+      <w:lvlJc w:val="left"/>
+      <w:pPr>
+        <w:tabs>
+          <w:tab w:val="num" w:pos="5760"/>
+        </w:tabs>
+        <w:ind w:left="5760" w:hanging="360"/>
+      </w:pPr>
+      <w:rPr>
+        <w:rFonts w:ascii="Wingdings" w:hAnsi="Wingdings" w:hint="default"/>
+        <w:sz w:val="20"/>
+      </w:rPr>
+    </w:lvl>
+    <w:lvl w:ilvl="8" w:tentative="1">
+      <w:start w:val="1"/>
+      <w:numFmt w:val="bullet"/>
+      <w:lvlText w:val=""/>
+      <w:lvlJc w:val="left"/>
+      <w:pPr>
+        <w:tabs>
+          <w:tab w:val="num" w:pos="6480"/>
+        </w:tabs>
+        <w:ind w:left="6480" w:hanging="360"/>
+      </w:pPr>
+      <w:rPr>
+        <w:rFonts w:ascii="Wingdings" w:hAnsi="Wingdings" w:hint="default"/>
+        <w:sz w:val="20"/>
+      </w:rPr>
+    </w:lvl>
+  </w:abstractNum>
+  <w:abstractNum w:abstractNumId="1" w15:restartNumberingAfterBreak="0">
+    <w:nsid w:val="230E00CC"/>
+    <w:multiLevelType w:val="multilevel"/>
+    <w:tmpl w:val="8E00304E"/>
+    <w:lvl w:ilvl="0">
+      <w:start w:val="1"/>
+      <w:numFmt w:val="bullet"/>
+      <w:lvlText w:val=""/>
+      <w:lvlJc w:val="left"/>
+      <w:pPr>
+        <w:tabs>
+          <w:tab w:val="num" w:pos="720"/>
+        </w:tabs>
+        <w:ind w:left="720" w:hanging="360"/>
+      </w:pPr>
+      <w:rPr>
+        <w:rFonts w:ascii="Symbol" w:hAnsi="Symbol" w:hint="default"/>
+        <w:sz w:val="20"/>
+      </w:rPr>
+    </w:lvl>
+    <w:lvl w:ilvl="1" w:tentative="1">
+      <w:start w:val="1"/>
+      <w:numFmt w:val="bullet"/>
+      <w:lvlText w:val="o"/>
+      <w:lvlJc w:val="left"/>
+      <w:pPr>
+        <w:tabs>
+          <w:tab w:val="num" w:pos="1440"/>
+        </w:tabs>
+        <w:ind w:left="1440" w:hanging="360"/>
+      </w:pPr>
+      <w:rPr>
+        <w:rFonts w:ascii="Courier New" w:hAnsi="Courier New" w:hint="default"/>
+        <w:sz w:val="20"/>
+      </w:rPr>
+    </w:lvl>
+    <w:lvl w:ilvl="2" w:tentative="1">
+      <w:start w:val="1"/>
+      <w:numFmt w:val="bullet"/>
+      <w:lvlText w:val=""/>
+      <w:lvlJc w:val="left"/>
+      <w:pPr>
+        <w:tabs>
+          <w:tab w:val="num" w:pos="2160"/>
+        </w:tabs>
+        <w:ind w:left="2160" w:hanging="360"/>
+      </w:pPr>
+      <w:rPr>
+        <w:rFonts w:ascii="Wingdings" w:hAnsi="Wingdings" w:hint="default"/>
+        <w:sz w:val="20"/>
+      </w:rPr>
+    </w:lvl>
+    <w:lvl w:ilvl="3" w:tentative="1">
+      <w:start w:val="1"/>
+      <w:numFmt w:val="bullet"/>
+      <w:lvlText w:val=""/>
+      <w:lvlJc w:val="left"/>
+      <w:pPr>
+        <w:tabs>
+          <w:tab w:val="num" w:pos="2880"/>
+        </w:tabs>
+        <w:ind w:left="2880" w:hanging="360"/>
+      </w:pPr>
+      <w:rPr>
+        <w:rFonts w:ascii="Wingdings" w:hAnsi="Wingdings" w:hint="default"/>
+        <w:sz w:val="20"/>
+      </w:rPr>
+    </w:lvl>
+    <w:lvl w:ilvl="4" w:tentative="1">
+      <w:start w:val="1"/>
+      <w:numFmt w:val="bullet"/>
+      <w:lvlText w:val=""/>
+      <w:lvlJc w:val="left"/>
+      <w:pPr>
+        <w:tabs>
+          <w:tab w:val="num" w:pos="3600"/>
+        </w:tabs>
+        <w:ind w:left="3600" w:hanging="360"/>
+      </w:pPr>
+      <w:rPr>
+        <w:rFonts w:ascii="Wingdings" w:hAnsi="Wingdings" w:hint="default"/>
+        <w:sz w:val="20"/>
+      </w:rPr>
+    </w:lvl>
+    <w:lvl w:ilvl="5" w:tentative="1">
+      <w:start w:val="1"/>
+      <w:numFmt w:val="bullet"/>
+      <w:lvlText w:val=""/>
+      <w:lvlJc w:val="left"/>
+      <w:pPr>
+        <w:tabs>
+          <w:tab w:val="num" w:pos="4320"/>
+        </w:tabs>
+        <w:ind w:left="4320" w:hanging="360"/>
+      </w:pPr>
+      <w:rPr>
+        <w:rFonts w:ascii="Wingdings" w:hAnsi="Wingdings" w:hint="default"/>
+        <w:sz w:val="20"/>
+      </w:rPr>
+    </w:lvl>
+    <w:lvl w:ilvl="6" w:tentative="1">
+      <w:start w:val="1"/>
+      <w:numFmt w:val="bullet"/>
+      <w:lvlText w:val=""/>
+      <w:lvlJc w:val="left"/>
+      <w:pPr>
+        <w:tabs>
+          <w:tab w:val="num" w:pos="5040"/>
+        </w:tabs>
+        <w:ind w:left="5040" w:hanging="360"/>
+      </w:pPr>
+      <w:rPr>
+        <w:rFonts w:ascii="Wingdings" w:hAnsi="Wingdings" w:hint="default"/>
+        <w:sz w:val="20"/>
+      </w:rPr>
+    </w:lvl>
+    <w:lvl w:ilvl="7" w:tentative="1">
+      <w:start w:val="1"/>
+      <w:numFmt w:val="bullet"/>
+      <w:lvlText w:val=""/>
+      <w:lvlJc w:val="left"/>
+      <w:pPr>
+        <w:tabs>
+          <w:tab w:val="num" w:pos="5760"/>
+        </w:tabs>
+        <w:ind w:left="5760" w:hanging="360"/>
+      </w:pPr>
+      <w:rPr>
+        <w:rFonts w:ascii="Wingdings" w:hAnsi="Wingdings" w:hint="default"/>
+        <w:sz w:val="20"/>
+      </w:rPr>
+    </w:lvl>
+    <w:lvl w:ilvl="8" w:tentative="1">
+      <w:start w:val="1"/>
+      <w:numFmt w:val="bullet"/>
+      <w:lvlText w:val=""/>
+      <w:lvlJc w:val="left"/>
+      <w:pPr>
+        <w:tabs>
+          <w:tab w:val="num" w:pos="6480"/>
+        </w:tabs>
+        <w:ind w:left="6480" w:hanging="360"/>
+      </w:pPr>
+      <w:rPr>
+        <w:rFonts w:ascii="Wingdings" w:hAnsi="Wingdings" w:hint="default"/>
+        <w:sz w:val="20"/>
+      </w:rPr>
+    </w:lvl>
+  </w:abstractNum>
+  <w:abstractNum w:abstractNumId="2" w15:restartNumberingAfterBreak="0">
+    <w:nsid w:val="6EDF269C"/>
+    <w:multiLevelType w:val="multilevel"/>
+    <w:tmpl w:val="EADA54E0"/>
+    <w:lvl w:ilvl="0">
+      <w:start w:val="1"/>
+      <w:numFmt w:val="bullet"/>
+      <w:lvlText w:val=""/>
+      <w:lvlJc w:val="left"/>
+      <w:pPr>
+        <w:tabs>
+          <w:tab w:val="num" w:pos="720"/>
+        </w:tabs>
+        <w:ind w:left="720" w:hanging="360"/>
+      </w:pPr>
+      <w:rPr>
+        <w:rFonts w:ascii="Symbol" w:hAnsi="Symbol" w:hint="default"/>
+        <w:sz w:val="20"/>
+      </w:rPr>
+    </w:lvl>
+    <w:lvl w:ilvl="1" w:tentative="1">
+      <w:start w:val="1"/>
+      <w:numFmt w:val="bullet"/>
+      <w:lvlText w:val="o"/>
+      <w:lvlJc w:val="left"/>
+      <w:pPr>
+        <w:tabs>
+          <w:tab w:val="num" w:pos="1440"/>
+        </w:tabs>
+        <w:ind w:left="1440" w:hanging="360"/>
+      </w:pPr>
+      <w:rPr>
+        <w:rFonts w:ascii="Courier New" w:hAnsi="Courier New" w:hint="default"/>
+        <w:sz w:val="20"/>
+      </w:rPr>
+    </w:lvl>
+    <w:lvl w:ilvl="2" w:tentative="1">
+      <w:start w:val="1"/>
+      <w:numFmt w:val="bullet"/>
+      <w:lvlText w:val=""/>
+      <w:lvlJc w:val="left"/>
+      <w:pPr>
+        <w:tabs>
+          <w:tab w:val="num" w:pos="2160"/>
+        </w:tabs>
+        <w:ind w:left="2160" w:hanging="360"/>
+      </w:pPr>
+      <w:rPr>
+        <w:rFonts w:ascii="Wingdings" w:hAnsi="Wingdings" w:hint="default"/>
+        <w:sz w:val="20"/>
+      </w:rPr>
+    </w:lvl>
+    <w:lvl w:ilvl="3" w:tentative="1">
+      <w:start w:val="1"/>
+      <w:numFmt w:val="bullet"/>
+      <w:lvlText w:val=""/>
+      <w:lvlJc w:val="left"/>
+      <w:pPr>
+        <w:tabs>
+          <w:tab w:val="num" w:pos="2880"/>
+        </w:tabs>
+        <w:ind w:left="2880" w:hanging="360"/>
+      </w:pPr>
+      <w:rPr>
+        <w:rFonts w:ascii="Wingdings" w:hAnsi="Wingdings" w:hint="default"/>
+        <w:sz w:val="20"/>
+      </w:rPr>
+    </w:lvl>
+    <w:lvl w:ilvl="4" w:tentative="1">
+      <w:start w:val="1"/>
+      <w:numFmt w:val="bullet"/>
+      <w:lvlText w:val=""/>
+      <w:lvlJc w:val="left"/>
+      <w:pPr>
+        <w:tabs>
+          <w:tab w:val="num" w:pos="3600"/>
+        </w:tabs>
+        <w:ind w:left="3600" w:hanging="360"/>
+      </w:pPr>
+      <w:rPr>
+        <w:rFonts w:ascii="Wingdings" w:hAnsi="Wingdings" w:hint="default"/>
+        <w:sz w:val="20"/>
+      </w:rPr>
+    </w:lvl>
+    <w:lvl w:ilvl="5" w:tentative="1">
+      <w:start w:val="1"/>
+      <w:numFmt w:val="bullet"/>
+      <w:lvlText w:val=""/>
+      <w:lvlJc w:val="left"/>
+      <w:pPr>
+        <w:tabs>
+          <w:tab w:val="num" w:pos="4320"/>
+        </w:tabs>
+        <w:ind w:left="4320" w:hanging="360"/>
+      </w:pPr>
+      <w:rPr>
+        <w:rFonts w:ascii="Wingdings" w:hAnsi="Wingdings" w:hint="default"/>
+        <w:sz w:val="20"/>
+      </w:rPr>
+    </w:lvl>
+    <w:lvl w:ilvl="6" w:tentative="1">
+      <w:start w:val="1"/>
+      <w:numFmt w:val="bullet"/>
+      <w:lvlText w:val=""/>
+      <w:lvlJc w:val="left"/>
+      <w:pPr>
+        <w:tabs>
+          <w:tab w:val="num" w:pos="5040"/>
+        </w:tabs>
+        <w:ind w:left="5040" w:hanging="360"/>
+      </w:pPr>
+      <w:rPr>
+        <w:rFonts w:ascii="Wingdings" w:hAnsi="Wingdings" w:hint="default"/>
+        <w:sz w:val="20"/>
+      </w:rPr>
+    </w:lvl>
+    <w:lvl w:ilvl="7" w:tentative="1">
+      <w:start w:val="1"/>
+      <w:numFmt w:val="bullet"/>
+      <w:lvlText w:val=""/>
+      <w:lvlJc w:val="left"/>
+      <w:pPr>
+        <w:tabs>
+          <w:tab w:val="num" w:pos="5760"/>
+        </w:tabs>
+        <w:ind w:left="5760" w:hanging="360"/>
+      </w:pPr>
+      <w:rPr>
+        <w:rFonts w:ascii="Wingdings" w:hAnsi="Wingdings" w:hint="default"/>
+        <w:sz w:val="20"/>
+      </w:rPr>
+    </w:lvl>
+    <w:lvl w:ilvl="8" w:tentative="1">
+      <w:start w:val="1"/>
+      <w:numFmt w:val="bullet"/>
+      <w:lvlText w:val=""/>
+      <w:lvlJc w:val="left"/>
+      <w:pPr>
+        <w:tabs>
+          <w:tab w:val="num" w:pos="6480"/>
+        </w:tabs>
+        <w:ind w:left="6480" w:hanging="360"/>
+      </w:pPr>
+      <w:rPr>
+        <w:rFonts w:ascii="Wingdings" w:hAnsi="Wingdings" w:hint="default"/>
+        <w:sz w:val="20"/>
+      </w:rPr>
+    </w:lvl>
+  </w:abstractNum>
+  <w:abstractNum w:abstractNumId="3" w15:restartNumberingAfterBreak="0">
+    <w:nsid w:val="70082ECA"/>
+    <w:multiLevelType w:val="multilevel"/>
+    <w:tmpl w:val="69043EC2"/>
+    <w:lvl w:ilvl="0">
+      <w:start w:val="1"/>
+      <w:numFmt w:val="bullet"/>
+      <w:lvlText w:val=""/>
+      <w:lvlJc w:val="left"/>
+      <w:pPr>
+        <w:tabs>
+          <w:tab w:val="num" w:pos="720"/>
+        </w:tabs>
+        <w:ind w:left="720" w:hanging="360"/>
+      </w:pPr>
+      <w:rPr>
+        <w:rFonts w:ascii="Symbol" w:hAnsi="Symbol" w:hint="default"/>
+        <w:sz w:val="20"/>
+      </w:rPr>
+    </w:lvl>
+    <w:lvl w:ilvl="1" w:tentative="1">
+      <w:start w:val="1"/>
+      <w:numFmt w:val="bullet"/>
+      <w:lvlText w:val="o"/>
+      <w:lvlJc w:val="left"/>
+      <w:pPr>
+        <w:tabs>
+          <w:tab w:val="num" w:pos="1440"/>
+        </w:tabs>
+        <w:ind w:left="1440" w:hanging="360"/>
+      </w:pPr>
+      <w:rPr>
+        <w:rFonts w:ascii="Courier New" w:hAnsi="Courier New" w:hint="default"/>
+        <w:sz w:val="20"/>
+      </w:rPr>
+    </w:lvl>
+    <w:lvl w:ilvl="2" w:tentative="1">
+      <w:start w:val="1"/>
+      <w:numFmt w:val="bullet"/>
+      <w:lvlText w:val=""/>
+      <w:lvlJc w:val="left"/>
+      <w:pPr>
+        <w:tabs>
+          <w:tab w:val="num" w:pos="2160"/>
+        </w:tabs>
+        <w:ind w:left="2160" w:hanging="360"/>
+      </w:pPr>
+      <w:rPr>
+        <w:rFonts w:ascii="Wingdings" w:hAnsi="Wingdings" w:hint="default"/>
+        <w:sz w:val="20"/>
+      </w:rPr>
+    </w:lvl>
+    <w:lvl w:ilvl="3" w:tentative="1">
+      <w:start w:val="1"/>
+      <w:numFmt w:val="bullet"/>
+      <w:lvlText w:val=""/>
+      <w:lvlJc w:val="left"/>
+      <w:pPr>
+        <w:tabs>
+          <w:tab w:val="num" w:pos="2880"/>
+        </w:tabs>
+        <w:ind w:left="2880" w:hanging="360"/>
+      </w:pPr>
+      <w:rPr>
+        <w:rFonts w:ascii="Wingdings" w:hAnsi="Wingdings" w:hint="default"/>
+        <w:sz w:val="20"/>
+      </w:rPr>
+    </w:lvl>
+    <w:lvl w:ilvl="4" w:tentative="1">
+      <w:start w:val="1"/>
+      <w:numFmt w:val="bullet"/>
+      <w:lvlText w:val=""/>
+      <w:lvlJc w:val="left"/>
+      <w:pPr>
+        <w:tabs>
+          <w:tab w:val="num" w:pos="3600"/>
+        </w:tabs>
+        <w:ind w:left="3600" w:hanging="360"/>
+      </w:pPr>
+      <w:rPr>
+        <w:rFonts w:ascii="Wingdings" w:hAnsi="Wingdings" w:hint="default"/>
+        <w:sz w:val="20"/>
+      </w:rPr>
+    </w:lvl>
+    <w:lvl w:ilvl="5" w:tentative="1">
+      <w:start w:val="1"/>
+      <w:numFmt w:val="bullet"/>
+      <w:lvlText w:val=""/>
+      <w:lvlJc w:val="left"/>
+      <w:pPr>
+        <w:tabs>
+          <w:tab w:val="num" w:pos="4320"/>
+        </w:tabs>
+        <w:ind w:left="4320" w:hanging="360"/>
+      </w:pPr>
+      <w:rPr>
+        <w:rFonts w:ascii="Wingdings" w:hAnsi="Wingdings" w:hint="default"/>
+        <w:sz w:val="20"/>
+      </w:rPr>
+    </w:lvl>
+    <w:lvl w:ilvl="6" w:tentative="1">
+      <w:start w:val="1"/>
+      <w:numFmt w:val="bullet"/>
+      <w:lvlText w:val=""/>
+      <w:lvlJc w:val="left"/>
+      <w:pPr>
+        <w:tabs>
+          <w:tab w:val="num" w:pos="5040"/>
+        </w:tabs>
+        <w:ind w:left="5040" w:hanging="360"/>
+      </w:pPr>
+      <w:rPr>
+        <w:rFonts w:ascii="Wingdings" w:hAnsi="Wingdings" w:hint="default"/>
+        <w:sz w:val="20"/>
+      </w:rPr>
+    </w:lvl>
+    <w:lvl w:ilvl="7" w:tentative="1">
+      <w:start w:val="1"/>
+      <w:numFmt w:val="bullet"/>
+      <w:lvlText w:val=""/>
+      <w:lvlJc w:val="left"/>
+      <w:pPr>
+        <w:tabs>
+          <w:tab w:val="num" w:pos="5760"/>
+        </w:tabs>
+        <w:ind w:left="5760" w:hanging="360"/>
+      </w:pPr>
+      <w:rPr>
+        <w:rFonts w:ascii="Wingdings" w:hAnsi="Wingdings" w:hint="default"/>
+        <w:sz w:val="20"/>
+      </w:rPr>
+    </w:lvl>
+    <w:lvl w:ilvl="8" w:tentative="1">
+      <w:start w:val="1"/>
+      <w:numFmt w:val="bullet"/>
+      <w:lvlText w:val=""/>
+      <w:lvlJc w:val="left"/>
+      <w:pPr>
+        <w:tabs>
+          <w:tab w:val="num" w:pos="6480"/>
+        </w:tabs>
+        <w:ind w:left="6480" w:hanging="360"/>
+      </w:pPr>
+      <w:rPr>
+        <w:rFonts w:ascii="Wingdings" w:hAnsi="Wingdings" w:hint="default"/>
+        <w:sz w:val="20"/>
+      </w:rPr>
+    </w:lvl>
+  </w:abstractNum>
+  <w:num w:numId="1" w16cid:durableId="1355306208">
+    <w:abstractNumId w:val="2"/>
+  </w:num>
+  <w:num w:numId="2" w16cid:durableId="232588664">
+    <w:abstractNumId w:val="3"/>
+  </w:num>
+  <w:num w:numId="3" w16cid:durableId="49884356">
+    <w:abstractNumId w:val="0"/>
+  </w:num>
+  <w:num w:numId="4" w16cid:durableId="1384451534">
+    <w:abstractNumId w:val="1"/>
+  </w:num>
+</w:numbering>
 </file>
 
 <file path=word/styles.xml><?xml version="1.0" encoding="utf-8"?>
@@ -683,7 +3870,6 @@
   <w:style w:type="character" w:default="1" w:styleId="DefaultParagraphFont">
     <w:name w:val="Default Paragraph Font"/>
     <w:uiPriority w:val="1"/>
-    <w:semiHidden/>
     <w:unhideWhenUsed/>
   </w:style>
   <w:style w:type="table" w:default="1" w:styleId="TableNormal">

</xml_diff>